<commit_message>
corrected typo in preprint
</commit_message>
<xml_diff>
--- a/communication/preprint/Hussey - 2026 - a critical reanalysis of Foody et al. 2013.docx
+++ b/communication/preprint/Hussey - 2026 - a critical reanalysis of Foody et al. 2013.docx
@@ -560,7 +560,7 @@
         <w:rPr>
           <w:lang w:val="en-US"/>
         </w:rPr>
-        <w:t xml:space="preserve">conducte </w:t>
+        <w:t xml:space="preserve">conduct </w:t>
       </w:r>
       <w:r>
         <w:rPr>
@@ -709,7 +709,21 @@
         <w:rPr>
           <w:lang w:val="en-US"/>
         </w:rPr>
-        <w:t>A long-standing debate within the literature on Acceptance and Commitment Therapy (REF) is whether or not ACT’s model of therapeutic change is or is not linked to the more basic science of learning and behavioral processes, specifically relational responding, described by Relational Frame Theory (REF</w:t>
+        <w:t xml:space="preserve">A long-standing debate within the literature on Acceptance and Commitment Therapy (REF) is </w:t>
+      </w:r>
+      <w:proofErr w:type="gramStart"/>
+      <w:r>
+        <w:rPr>
+          <w:lang w:val="en-US"/>
+        </w:rPr>
+        <w:t>whether or not</w:t>
+      </w:r>
+      <w:proofErr w:type="gramEnd"/>
+      <w:r>
+        <w:rPr>
+          <w:lang w:val="en-US"/>
+        </w:rPr>
+        <w:t xml:space="preserve"> ACT’s model of therapeutic change is or is not linked to the more basic science of learning and behavioral processes, specifically relational responding, described by Relational Frame Theory (REF</w:t>
       </w:r>
       <w:r>
         <w:rPr>
@@ -1669,7 +1683,21 @@
         <w:rPr>
           <w:lang w:val="en-US"/>
         </w:rPr>
-        <w:t xml:space="preserve">Again, this takes the conclusions of Foody et al. (2013) at face value without interrogating the strength of the evidence it actually provides for the claim. </w:t>
+        <w:t xml:space="preserve">Again, this takes the conclusions of Foody et al. (2013) at face value without interrogating the strength of the evidence it </w:t>
+      </w:r>
+      <w:proofErr w:type="gramStart"/>
+      <w:r>
+        <w:rPr>
+          <w:lang w:val="en-US"/>
+        </w:rPr>
+        <w:t>actually provides</w:t>
+      </w:r>
+      <w:proofErr w:type="gramEnd"/>
+      <w:r>
+        <w:rPr>
+          <w:lang w:val="en-US"/>
+        </w:rPr>
+        <w:t xml:space="preserve"> for the claim. </w:t>
       </w:r>
       <w:r>
         <w:rPr>
@@ -1971,7 +1999,23 @@
           <w:rStyle w:val="citation"/>
           <w:lang w:val="en-US"/>
         </w:rPr>
-        <w:t xml:space="preserve">by Pendrous et al. </w:t>
+        <w:t xml:space="preserve">by </w:t>
+      </w:r>
+      <w:proofErr w:type="spellStart"/>
+      <w:r>
+        <w:rPr>
+          <w:rStyle w:val="citation"/>
+          <w:lang w:val="en-US"/>
+        </w:rPr>
+        <w:t>Pendrous</w:t>
+      </w:r>
+      <w:proofErr w:type="spellEnd"/>
+      <w:r>
+        <w:rPr>
+          <w:rStyle w:val="citation"/>
+          <w:lang w:val="en-US"/>
+        </w:rPr>
+        <w:t xml:space="preserve"> et al. </w:t>
       </w:r>
       <w:r>
         <w:rPr>
@@ -3272,7 +3316,25 @@
           <w:iCs/>
           <w:lang w:val="en-US"/>
         </w:rPr>
-        <w:t>“the research was a replication … except that we were able to use less intensive interventions with our non-clinical sample”</w:t>
+        <w:t xml:space="preserve">“the research was a replication … except that we were able to use </w:t>
+      </w:r>
+      <w:proofErr w:type="gramStart"/>
+      <w:r>
+        <w:rPr>
+          <w:i/>
+          <w:iCs/>
+          <w:lang w:val="en-US"/>
+        </w:rPr>
+        <w:t>less</w:t>
+      </w:r>
+      <w:proofErr w:type="gramEnd"/>
+      <w:r>
+        <w:rPr>
+          <w:i/>
+          <w:iCs/>
+          <w:lang w:val="en-US"/>
+        </w:rPr>
+        <w:t xml:space="preserve"> intensive interventions with our non-clinical sample”</w:t>
       </w:r>
       <w:r>
         <w:rPr>
@@ -4406,13 +4468,35 @@
         <w:rPr>
           <w:lang w:val="en-US"/>
         </w:rPr>
-        <w:t xml:space="preserve"> effects, and mood tends to return to baseline levels within a very short period of time. As such, </w:t>
-      </w:r>
-      <w:r>
-        <w:rPr>
-          <w:lang w:val="en-US"/>
-        </w:rPr>
-        <w:t xml:space="preserve">in order to be able to differentiate between any change in mood due to the intervention vs. due to natural improvement over time, a negative control </w:t>
+        <w:t xml:space="preserve"> effects, and mood tends to return to baseline levels within a very short </w:t>
+      </w:r>
+      <w:proofErr w:type="gramStart"/>
+      <w:r>
+        <w:rPr>
+          <w:lang w:val="en-US"/>
+        </w:rPr>
+        <w:t>period of time</w:t>
+      </w:r>
+      <w:proofErr w:type="gramEnd"/>
+      <w:r>
+        <w:rPr>
+          <w:lang w:val="en-US"/>
+        </w:rPr>
+        <w:t xml:space="preserve">. As such, </w:t>
+      </w:r>
+      <w:proofErr w:type="gramStart"/>
+      <w:r>
+        <w:rPr>
+          <w:lang w:val="en-US"/>
+        </w:rPr>
+        <w:t>in order to</w:t>
+      </w:r>
+      <w:proofErr w:type="gramEnd"/>
+      <w:r>
+        <w:rPr>
+          <w:lang w:val="en-US"/>
+        </w:rPr>
+        <w:t xml:space="preserve"> be able to differentiate between any change in mood due to the intervention vs. due to natural improvement over time, a negative control </w:t>
       </w:r>
       <w:r>
         <w:rPr>
@@ -4889,7 +4973,21 @@
         <w:rPr>
           <w:lang w:val="en-US"/>
         </w:rPr>
-        <w:t xml:space="preserve">did not include any such control condition where no intervention was provided, and did not discuss the highly plausible possibility that any reductions in distress after intervention were merely due to spontaneous recovery rather than due to their intervention. At the same time, it is plausible that Foody and colleagues were aware of this </w:t>
+        <w:t xml:space="preserve">did not include any such control condition where no intervention was </w:t>
+      </w:r>
+      <w:proofErr w:type="gramStart"/>
+      <w:r>
+        <w:rPr>
+          <w:lang w:val="en-US"/>
+        </w:rPr>
+        <w:t>provided, and</w:t>
+      </w:r>
+      <w:proofErr w:type="gramEnd"/>
+      <w:r>
+        <w:rPr>
+          <w:lang w:val="en-US"/>
+        </w:rPr>
+        <w:t xml:space="preserve"> did not discuss the highly plausible possibility that any reductions in distress after intervention were merely due to spontaneous recovery rather than due to their intervention. At the same time, it is plausible that Foody and colleagues were aware of this </w:t>
       </w:r>
       <w:r>
         <w:rPr>
@@ -5351,7 +5449,23 @@
           <w:rStyle w:val="highlight"/>
           <w:lang w:val="en-US"/>
         </w:rPr>
-        <w:t>hypothesis is accepted on the basis of one or more positive results among multiple tests</w:t>
+        <w:t xml:space="preserve">hypothesis is accepted </w:t>
+      </w:r>
+      <w:proofErr w:type="gramStart"/>
+      <w:r>
+        <w:rPr>
+          <w:rStyle w:val="highlight"/>
+          <w:lang w:val="en-US"/>
+        </w:rPr>
+        <w:t>on the basis of</w:t>
+      </w:r>
+      <w:proofErr w:type="gramEnd"/>
+      <w:r>
+        <w:rPr>
+          <w:rStyle w:val="highlight"/>
+          <w:lang w:val="en-US"/>
+        </w:rPr>
+        <w:t xml:space="preserve"> one or more positive results among multiple tests</w:t>
       </w:r>
       <w:r>
         <w:rPr>
@@ -5532,7 +5646,23 @@
           <w:rStyle w:val="highlight"/>
           <w:lang w:val="en-US"/>
         </w:rPr>
-        <w:t xml:space="preserve">If one is willing to accept the alternative hypothesis on the basis of </w:t>
+        <w:t xml:space="preserve">If one is willing to accept the alternative hypothesis </w:t>
+      </w:r>
+      <w:proofErr w:type="gramStart"/>
+      <w:r>
+        <w:rPr>
+          <w:rStyle w:val="highlight"/>
+          <w:lang w:val="en-US"/>
+        </w:rPr>
+        <w:t>on the basis of</w:t>
+      </w:r>
+      <w:proofErr w:type="gramEnd"/>
+      <w:r>
+        <w:rPr>
+          <w:rStyle w:val="highlight"/>
+          <w:lang w:val="en-US"/>
+        </w:rPr>
+        <w:t xml:space="preserve"> </w:t>
       </w:r>
       <w:r>
         <w:rPr>
@@ -5622,7 +5752,23 @@
         <w:rPr>
           <w:lang w:val="en-US"/>
         </w:rPr>
-        <w:t xml:space="preserve">implemented using R’s p.adjust function) </w:t>
+        <w:t xml:space="preserve">implemented using R’s </w:t>
+      </w:r>
+      <w:proofErr w:type="spellStart"/>
+      <w:proofErr w:type="gramStart"/>
+      <w:r>
+        <w:rPr>
+          <w:lang w:val="en-US"/>
+        </w:rPr>
+        <w:t>p.adjust</w:t>
+      </w:r>
+      <w:proofErr w:type="spellEnd"/>
+      <w:proofErr w:type="gramEnd"/>
+      <w:r>
+        <w:rPr>
+          <w:lang w:val="en-US"/>
+        </w:rPr>
+        <w:t xml:space="preserve"> function) </w:t>
       </w:r>
       <w:r>
         <w:rPr>
@@ -5630,11 +5776,19 @@
         </w:rPr>
         <w:t xml:space="preserve">to Foody et al.’s (2013) interaction effects </w:t>
       </w:r>
-      <w:r>
-        <w:rPr>
-          <w:lang w:val="en-US"/>
-        </w:rPr>
-        <w:t xml:space="preserve">produces three non-significant adjusted </w:t>
+      <w:proofErr w:type="gramStart"/>
+      <w:r>
+        <w:rPr>
+          <w:lang w:val="en-US"/>
+        </w:rPr>
+        <w:t>produces</w:t>
+      </w:r>
+      <w:proofErr w:type="gramEnd"/>
+      <w:r>
+        <w:rPr>
+          <w:lang w:val="en-US"/>
+        </w:rPr>
+        <w:t xml:space="preserve"> three non-significant adjusted </w:t>
       </w:r>
       <w:r>
         <w:rPr>
@@ -5650,6 +5804,7 @@
         </w:rPr>
         <w:t xml:space="preserve"> values (i.e., discomfort: </w:t>
       </w:r>
+      <w:proofErr w:type="spellStart"/>
       <w:r>
         <w:rPr>
           <w:i/>
@@ -5665,12 +5820,14 @@
         </w:rPr>
         <w:t>adj</w:t>
       </w:r>
+      <w:proofErr w:type="spellEnd"/>
       <w:r>
         <w:rPr>
           <w:lang w:val="en-US"/>
         </w:rPr>
         <w:t xml:space="preserve"> = .66, anxiety: </w:t>
       </w:r>
+      <w:proofErr w:type="spellStart"/>
       <w:r>
         <w:rPr>
           <w:i/>
@@ -5686,12 +5843,14 @@
         </w:rPr>
         <w:t>adj</w:t>
       </w:r>
+      <w:proofErr w:type="spellEnd"/>
       <w:r>
         <w:rPr>
           <w:lang w:val="en-US"/>
         </w:rPr>
         <w:t xml:space="preserve"> = .66, stress: </w:t>
       </w:r>
+      <w:proofErr w:type="spellStart"/>
       <w:r>
         <w:rPr>
           <w:i/>
@@ -5707,6 +5866,7 @@
         </w:rPr>
         <w:t>adj</w:t>
       </w:r>
+      <w:proofErr w:type="spellEnd"/>
       <w:r>
         <w:rPr>
           <w:lang w:val="en-US"/>
@@ -5785,11 +5945,19 @@
           <w:lang w:val="en-US"/>
         </w:rPr>
       </w:pPr>
-      <w:r>
-        <w:rPr>
-          <w:lang w:val="en-US"/>
-        </w:rPr>
-        <w:t xml:space="preserve">In order to support their claim, an elaborated or alternative analytic strategy would be needed. For example, post hoc contrasts could have been used to test for differences in means between the groups at each time points; or to differences in means at the post-intervention time point could have simply been assessed </w:t>
+      <w:proofErr w:type="gramStart"/>
+      <w:r>
+        <w:rPr>
+          <w:lang w:val="en-US"/>
+        </w:rPr>
+        <w:t>In order to</w:t>
+      </w:r>
+      <w:proofErr w:type="gramEnd"/>
+      <w:r>
+        <w:rPr>
+          <w:lang w:val="en-US"/>
+        </w:rPr>
+        <w:t xml:space="preserve"> support their claim, an elaborated or alternative analytic strategy would be needed. For example, post hoc contrasts could have been used to test for differences in means between the groups at each time points; or to differences in means at the post-intervention time point could have simply been assessed </w:t>
       </w:r>
       <w:r>
         <w:rPr>
@@ -6461,17 +6629,33 @@
         </w:rPr>
         <w:t>; “</w:t>
       </w:r>
-      <w:r>
-        <w:rPr>
-          <w:lang w:val="en-US"/>
-        </w:rPr>
-        <w:t>self distinction (N =12); self hierarchy (N =12</w:t>
-      </w:r>
-      <w:r>
-        <w:rPr>
-          <w:lang w:val="en-US"/>
-        </w:rPr>
-        <w:t>)</w:t>
+      <w:proofErr w:type="spellStart"/>
+      <w:r>
+        <w:rPr>
+          <w:lang w:val="en-US"/>
+        </w:rPr>
+        <w:t>self distinction</w:t>
+      </w:r>
+      <w:proofErr w:type="spellEnd"/>
+      <w:r>
+        <w:rPr>
+          <w:lang w:val="en-US"/>
+        </w:rPr>
+        <w:t xml:space="preserve"> (N =12); </w:t>
+      </w:r>
+      <w:proofErr w:type="spellStart"/>
+      <w:r>
+        <w:rPr>
+          <w:lang w:val="en-US"/>
+        </w:rPr>
+        <w:t>self hierarchy</w:t>
+      </w:r>
+      <w:proofErr w:type="spellEnd"/>
+      <w:r>
+        <w:rPr>
+          <w:lang w:val="en-US"/>
+        </w:rPr>
+        <w:t xml:space="preserve"> (N =12)</w:t>
       </w:r>
       <w:r>
         <w:rPr>
@@ -6647,7 +6831,21 @@
         <w:rPr>
           <w:lang w:val="en-US"/>
         </w:rPr>
-        <w:t xml:space="preserve"> using WebPlotDigitizer </w:t>
+        <w:t xml:space="preserve"> using </w:t>
+      </w:r>
+      <w:proofErr w:type="spellStart"/>
+      <w:r>
+        <w:rPr>
+          <w:lang w:val="en-US"/>
+        </w:rPr>
+        <w:t>WebPlotDigitizer</w:t>
+      </w:r>
+      <w:proofErr w:type="spellEnd"/>
+      <w:r>
+        <w:rPr>
+          <w:lang w:val="en-US"/>
+        </w:rPr>
+        <w:t xml:space="preserve"> </w:t>
       </w:r>
       <w:r>
         <w:rPr>
@@ -6794,6 +6992,7 @@
         </w:rPr>
         <w:t xml:space="preserve"> method for the </w:t>
       </w:r>
+      <w:proofErr w:type="spellStart"/>
       <w:r>
         <w:rPr>
           <w:lang w:val="en-US"/>
@@ -6806,6 +7005,7 @@
         </w:rPr>
         <w:t>analyses</w:t>
       </w:r>
+      <w:proofErr w:type="spellEnd"/>
       <w:r>
         <w:rPr>
           <w:lang w:val="en-US"/>
@@ -7037,11 +7237,19 @@
           <w:lang w:val="en-US"/>
         </w:rPr>
       </w:pPr>
-      <w:r>
-        <w:rPr>
-          <w:lang w:val="en-US"/>
-        </w:rPr>
-        <w:t xml:space="preserve">In order to compare differences between the distinction and hierarchy conditions at the post-intervention time point, while also acknowledging that there may be legitimate analytic </w:t>
+      <w:proofErr w:type="gramStart"/>
+      <w:r>
+        <w:rPr>
+          <w:lang w:val="en-US"/>
+        </w:rPr>
+        <w:t>In order to</w:t>
+      </w:r>
+      <w:proofErr w:type="gramEnd"/>
+      <w:r>
+        <w:rPr>
+          <w:lang w:val="en-US"/>
+        </w:rPr>
+        <w:t xml:space="preserve"> compare differences between the distinction and hierarchy conditions at the post-intervention time point, while also acknowledging that there may be legitimate analytic </w:t>
       </w:r>
     </w:p>
     <w:p>
@@ -7188,7 +7396,21 @@
         <w:rPr>
           <w:lang w:val="en-US"/>
         </w:rPr>
-        <w:t xml:space="preserve">), and degrees of freedom (df) using the below equations. </w:t>
+        <w:t>), and degrees of freedom (</w:t>
+      </w:r>
+      <w:proofErr w:type="spellStart"/>
+      <w:r>
+        <w:rPr>
+          <w:lang w:val="en-US"/>
+        </w:rPr>
+        <w:t>df</w:t>
+      </w:r>
+      <w:proofErr w:type="spellEnd"/>
+      <w:r>
+        <w:rPr>
+          <w:lang w:val="en-US"/>
+        </w:rPr>
+        <w:t xml:space="preserve">) using the below equations. </w:t>
       </w:r>
     </w:p>
     <w:p>
@@ -8421,7 +8643,21 @@
         <w:rPr>
           <w:lang w:val="en-US"/>
         </w:rPr>
-        <w:t xml:space="preserve"> and df) and Bonferroni-corrected </w:t>
+        <w:t xml:space="preserve"> and </w:t>
+      </w:r>
+      <w:proofErr w:type="spellStart"/>
+      <w:r>
+        <w:rPr>
+          <w:lang w:val="en-US"/>
+        </w:rPr>
+        <w:t>df</w:t>
+      </w:r>
+      <w:proofErr w:type="spellEnd"/>
+      <w:r>
+        <w:rPr>
+          <w:lang w:val="en-US"/>
+        </w:rPr>
+        <w:t xml:space="preserve">) and Bonferroni-corrected </w:t>
       </w:r>
       <w:r>
         <w:rPr>
@@ -8522,7 +8758,21 @@
         <w:rPr>
           <w:lang w:val="en-US"/>
         </w:rPr>
-        <w:t xml:space="preserve">As discussed previously, Foody et al. (2013) make claims in their abstract and discussion regarding the superiority of the hierarchical intervention over the distinction intervention with regard to decreasing “distress” </w:t>
+        <w:t xml:space="preserve">As discussed previously, Foody et al. (2013) make claims in their abstract and discussion regarding the superiority of the hierarchical intervention over the distinction intervention </w:t>
+      </w:r>
+      <w:proofErr w:type="gramStart"/>
+      <w:r>
+        <w:rPr>
+          <w:lang w:val="en-US"/>
+        </w:rPr>
+        <w:t>with regard to</w:t>
+      </w:r>
+      <w:proofErr w:type="gramEnd"/>
+      <w:r>
+        <w:rPr>
+          <w:lang w:val="en-US"/>
+        </w:rPr>
+        <w:t xml:space="preserve"> decreasing “distress” </w:t>
       </w:r>
       <w:r>
         <w:rPr>
@@ -8620,7 +8870,21 @@
         <w:rPr>
           <w:lang w:val="en-US"/>
         </w:rPr>
-        <w:t xml:space="preserve">avoid any potential issues with regard to how to interpret </w:t>
+        <w:t xml:space="preserve">avoid any potential issues </w:t>
+      </w:r>
+      <w:proofErr w:type="gramStart"/>
+      <w:r>
+        <w:rPr>
+          <w:lang w:val="en-US"/>
+        </w:rPr>
+        <w:t>with regard to</w:t>
+      </w:r>
+      <w:proofErr w:type="gramEnd"/>
+      <w:r>
+        <w:rPr>
+          <w:lang w:val="en-US"/>
+        </w:rPr>
+        <w:t xml:space="preserve"> how to interpret </w:t>
       </w:r>
       <w:r>
         <w:rPr>
@@ -8632,7 +8896,21 @@
         <w:rPr>
           <w:lang w:val="en-US"/>
         </w:rPr>
-        <w:t xml:space="preserve">between outcome measures, as observed in Foody et al. (2013), where significant results were found for only one of three outcome measures (“stress”) but the authors made more conclusions about “distress”. </w:t>
+        <w:t>between outcome measures, as observed in Foody et al. (2013), where significant results were found for only one of three outcome measures (“stress”</w:t>
+      </w:r>
+      <w:proofErr w:type="gramStart"/>
+      <w:r>
+        <w:rPr>
+          <w:lang w:val="en-US"/>
+        </w:rPr>
+        <w:t>)</w:t>
+      </w:r>
+      <w:proofErr w:type="gramEnd"/>
+      <w:r>
+        <w:rPr>
+          <w:lang w:val="en-US"/>
+        </w:rPr>
+        <w:t xml:space="preserve"> but the authors made more conclusions about “distress”. </w:t>
       </w:r>
       <w:r>
         <w:rPr>
@@ -8951,7 +9229,21 @@
         <w:rPr>
           <w:lang w:val="en-US"/>
         </w:rPr>
-        <w:t>Note that because the pooled effect size provides a single test of the hypothesis, no Bonferroni-adjusted version of the Confidence Intervals was corrected. All four outcome measures (anxiety, discomfort, stress, and the pooled outcome measure) were employed in the multiverse analysis in order to attempt to understand the robustness of conclusions to the choice of outcome measure.</w:t>
+        <w:t xml:space="preserve">Note that because the pooled effect size provides a single test of the hypothesis, no Bonferroni-adjusted version of the Confidence Intervals was corrected. All four outcome measures (anxiety, discomfort, stress, and the pooled outcome measure) were employed in the multiverse analysis </w:t>
+      </w:r>
+      <w:proofErr w:type="gramStart"/>
+      <w:r>
+        <w:rPr>
+          <w:lang w:val="en-US"/>
+        </w:rPr>
+        <w:t>in order to</w:t>
+      </w:r>
+      <w:proofErr w:type="gramEnd"/>
+      <w:r>
+        <w:rPr>
+          <w:lang w:val="en-US"/>
+        </w:rPr>
+        <w:t xml:space="preserve"> attempt to understand the robustness of conclusions to the choice of outcome measure.</w:t>
       </w:r>
     </w:p>
     <w:p>
@@ -9281,7 +9573,23 @@
           <w:iCs/>
           <w:lang w:val="en-US"/>
         </w:rPr>
-        <w:t>(corrected for baseline scores) were entered into the multiverse analysis in order to assess the robustness of conclusions to this analytic choice</w:t>
+        <w:t xml:space="preserve">(corrected for baseline scores) were entered into the multiverse analysis </w:t>
+      </w:r>
+      <w:proofErr w:type="gramStart"/>
+      <w:r>
+        <w:rPr>
+          <w:iCs/>
+          <w:lang w:val="en-US"/>
+        </w:rPr>
+        <w:t>in order to</w:t>
+      </w:r>
+      <w:proofErr w:type="gramEnd"/>
+      <w:r>
+        <w:rPr>
+          <w:iCs/>
+          <w:lang w:val="en-US"/>
+        </w:rPr>
+        <w:t xml:space="preserve"> assess the robustness of conclusions to this analytic choice</w:t>
       </w:r>
       <w:r>
         <w:rPr>
@@ -9839,6 +10147,7 @@
         </w:rPr>
         <w:t xml:space="preserve">critiques and </w:t>
       </w:r>
+      <w:proofErr w:type="spellStart"/>
       <w:r>
         <w:rPr>
           <w:lang w:val="en-US"/>
@@ -9849,7 +10158,14 @@
         <w:rPr>
           <w:lang w:val="en-US"/>
         </w:rPr>
-        <w:t xml:space="preserve">es </w:t>
+        <w:t>es</w:t>
+      </w:r>
+      <w:proofErr w:type="spellEnd"/>
+      <w:r>
+        <w:rPr>
+          <w:lang w:val="en-US"/>
+        </w:rPr>
+        <w:t xml:space="preserve"> </w:t>
       </w:r>
       <w:r>
         <w:rPr>
@@ -9972,7 +10288,14 @@
         <w:rPr>
           <w:lang w:val="en-US"/>
         </w:rPr>
-        <w:t xml:space="preserve">hical relations with mental content produces superior therapeutic outcomes </w:t>
+        <w:t xml:space="preserve">hical relations with mental content produces superior therapeutic </w:t>
+      </w:r>
+      <w:proofErr w:type="gramStart"/>
+      <w:r>
+        <w:rPr>
+          <w:lang w:val="en-US"/>
+        </w:rPr>
+        <w:t xml:space="preserve">outcomes </w:t>
       </w:r>
       <w:r>
         <w:rPr>
@@ -9984,7 +10307,14 @@
         <w:rPr>
           <w:lang w:val="en-US"/>
         </w:rPr>
-        <w:t xml:space="preserve">to </w:t>
+        <w:t>to</w:t>
+      </w:r>
+      <w:proofErr w:type="gramEnd"/>
+      <w:r>
+        <w:rPr>
+          <w:lang w:val="en-US"/>
+        </w:rPr>
+        <w:t xml:space="preserve"> </w:t>
       </w:r>
       <w:r>
         <w:rPr>
@@ -10002,7 +10332,21 @@
         <w:rPr>
           <w:lang w:val="en-US"/>
         </w:rPr>
-        <w:t xml:space="preserve"> therefore </w:t>
+        <w:t xml:space="preserve"> </w:t>
+      </w:r>
+      <w:proofErr w:type="gramStart"/>
+      <w:r>
+        <w:rPr>
+          <w:lang w:val="en-US"/>
+        </w:rPr>
+        <w:t>therefore</w:t>
+      </w:r>
+      <w:proofErr w:type="gramEnd"/>
+      <w:r>
+        <w:rPr>
+          <w:lang w:val="en-US"/>
+        </w:rPr>
+        <w:t xml:space="preserve"> </w:t>
       </w:r>
       <w:r>
         <w:rPr>
@@ -10157,7 +10501,21 @@
         <w:rPr>
           <w:lang w:val="en-US"/>
         </w:rPr>
-        <w:t xml:space="preserve"> should give us pause for thought. Some may be quick to suggest that this is a single unfortunate example. It may be worth recalling that similar appeals to exceptionalism were made early in the replication crisis, and yet the problems kept spreading to new areas of work people previously argued to be unaffected. We must be careful to avoid hubris here too, and instead be open to the possibility that many areas of our work are built on extremely shaky foundations. </w:t>
+        <w:t xml:space="preserve"> should give us pause for thought. Some may be quick to suggest that this is a single unfortunate example. It may be worth recalling that similar appeals to exceptionalism were made early in the replication crisis, and yet the problems kept spreading to new areas of work people previously argued to be unaffected. We must be careful to avoid hubris here </w:t>
+      </w:r>
+      <w:proofErr w:type="gramStart"/>
+      <w:r>
+        <w:rPr>
+          <w:lang w:val="en-US"/>
+        </w:rPr>
+        <w:t>too, and</w:t>
+      </w:r>
+      <w:proofErr w:type="gramEnd"/>
+      <w:r>
+        <w:rPr>
+          <w:lang w:val="en-US"/>
+        </w:rPr>
+        <w:t xml:space="preserve"> instead be open to the possibility that many areas of our work are built on extremely shaky foundations. </w:t>
       </w:r>
     </w:p>
     <w:p>
@@ -12688,6 +13046,7 @@
   <w:style w:type="character" w:default="1" w:styleId="DefaultParagraphFont">
     <w:name w:val="Default Paragraph Font"/>
     <w:uiPriority w:val="1"/>
+    <w:semiHidden/>
     <w:unhideWhenUsed/>
   </w:style>
   <w:style w:type="table" w:default="1" w:styleId="TableNormal">

</xml_diff>

<commit_message>
references and typos in preprint
</commit_message>
<xml_diff>
--- a/communication/preprint/Hussey - 2026 - a critical reanalysis of Foody et al. 2013.docx
+++ b/communication/preprint/Hussey - 2026 - a critical reanalysis of Foody et al. 2013.docx
@@ -709,27 +709,81 @@
         <w:rPr>
           <w:lang w:val="en-US"/>
         </w:rPr>
-        <w:t xml:space="preserve">A long-standing debate within the literature on Acceptance and Commitment Therapy (REF) is </w:t>
-      </w:r>
-      <w:proofErr w:type="gramStart"/>
-      <w:r>
-        <w:rPr>
-          <w:lang w:val="en-US"/>
-        </w:rPr>
-        <w:t>whether or not</w:t>
-      </w:r>
-      <w:proofErr w:type="gramEnd"/>
-      <w:r>
-        <w:rPr>
-          <w:lang w:val="en-US"/>
-        </w:rPr>
-        <w:t xml:space="preserve"> ACT’s model of therapeutic change is or is not linked to the more basic science of learning and behavioral processes, specifically relational responding, described by Relational Frame Theory (REF</w:t>
-      </w:r>
-      <w:r>
-        <w:rPr>
-          <w:lang w:val="en-US"/>
-        </w:rPr>
-        <w:t xml:space="preserve">). </w:t>
+        <w:t xml:space="preserve">A long-standing debate within the literature on Acceptance and Commitment Therapy </w:t>
+      </w:r>
+      <w:r>
+        <w:rPr>
+          <w:lang w:val="en-US"/>
+        </w:rPr>
+        <w:fldChar w:fldCharType="begin"/>
+      </w:r>
+      <w:r>
+        <w:rPr>
+          <w:lang w:val="en-US"/>
+        </w:rPr>
+        <w:instrText xml:space="preserve"> ADDIN ZOTERO_ITEM CSL_CITATION {"citationID":"2dGs8WzI","properties":{"formattedCitation":"(Hayes et al., 1999)","plainCitation":"(Hayes et al., 1999)","noteIndex":0},"citationItems":[{"id":1816,"uris":["http://zotero.org/users/1687755/items/RW6HQ5RW"],"itemData":{"id":1816,"type":"book","abstract":"The prevailing view among therapists as well as clients is that a more vital life can be attained by overcoming negative thoughts and feelings. Yet despite efforts to achieve this goal, many individuals continue to suffer with behavior disorders, adjustment difficulties, and low life satisfaction. Acceptance and Commitment Therapy (ACT) is a unique psychotherapeutic approach that addresses this issue by altering the very ground on which rational change strategies rest. Within a coherent theoretical and philosophical framework, ACT illuminates the ways clients understand and perpetuate their difficulties through language. The book shows how interventions based on metaphor, paradox, and experiential exercises can enable clients to break free of language traps and make contact with thoughts, feelings, memories, and physical sensations that have been feared and avoided. Detailed guidelines are presented for helping clients recontextualize and accept these private events, develop greater clarity about personal values, and commit to needed behavior change. Providing in one volume a scientifically sound theory of psychopathology and a practical treatment model, and illustrated by a wealth of clinical examples, this is an important resource for practitioners and students in the full range of behavioral health care fields.","ISBN":"978-1-57230-481-9","language":"en","number-of-pages":"324","publisher":"Guilford Press","source":"Google Books","title":"Acceptance and Commitment Therapy: An experiential approach to behavior change","title-short":"Acceptance and Commitment Therapy","author":[{"family":"Hayes","given":"Steven C."},{"family":"Strosahl","given":"Kirk"},{"family":"Wilson","given":"Kelly G."}],"issued":{"date-parts":[["1999"]]}}}],"schema":"https://github.com/citation-style-language/schema/raw/master/csl-citation.json"} </w:instrText>
+      </w:r>
+      <w:r>
+        <w:rPr>
+          <w:lang w:val="en-US"/>
+        </w:rPr>
+        <w:fldChar w:fldCharType="separate"/>
+      </w:r>
+      <w:r>
+        <w:rPr>
+          <w:noProof/>
+          <w:lang w:val="en-US"/>
+        </w:rPr>
+        <w:t>(Hayes et al., 1999)</w:t>
+      </w:r>
+      <w:r>
+        <w:rPr>
+          <w:lang w:val="en-US"/>
+        </w:rPr>
+        <w:fldChar w:fldCharType="end"/>
+      </w:r>
+      <w:r>
+        <w:rPr>
+          <w:lang w:val="en-US"/>
+        </w:rPr>
+        <w:t xml:space="preserve"> is whether or not ACT’s model of therapeutic change is or is not linked to the more basic science of learning and behavioral processes, specifically relational responding, described by Relational Frame Theory </w:t>
+      </w:r>
+      <w:r>
+        <w:rPr>
+          <w:lang w:val="en-US"/>
+        </w:rPr>
+        <w:fldChar w:fldCharType="begin"/>
+      </w:r>
+      <w:r>
+        <w:rPr>
+          <w:lang w:val="en-US"/>
+        </w:rPr>
+        <w:instrText xml:space="preserve"> ADDIN ZOTERO_ITEM CSL_CITATION {"citationID":"HslUZC8K","properties":{"formattedCitation":"(Hayes et al., 2001)","plainCitation":"(Hayes et al., 2001)","noteIndex":0},"citationItems":[{"id":1834,"uris":["http://zotero.org/users/1687755/items/97BA6F6P"],"itemData":{"id":1834,"type":"book","event-place":"New York","publisher":"Kluwer Academic/Plenum Press","publisher-place":"New York","title":"Relational frame theory: A post-Skinnerian account of human language and cognition","title-short":"Relational frame theory","author":[{"family":"Hayes","given":"Steven C."},{"family":"Barnes-Holmes","given":"Dermot"},{"family":"Roche","given":"Bryan"}],"issued":{"date-parts":[["2001"]]}}}],"schema":"https://github.com/citation-style-language/schema/raw/master/csl-citation.json"} </w:instrText>
+      </w:r>
+      <w:r>
+        <w:rPr>
+          <w:lang w:val="en-US"/>
+        </w:rPr>
+        <w:fldChar w:fldCharType="separate"/>
+      </w:r>
+      <w:r>
+        <w:rPr>
+          <w:noProof/>
+          <w:lang w:val="en-US"/>
+        </w:rPr>
+        <w:t>(Hayes et al., 2001)</w:t>
+      </w:r>
+      <w:r>
+        <w:rPr>
+          <w:lang w:val="en-US"/>
+        </w:rPr>
+        <w:fldChar w:fldCharType="end"/>
+      </w:r>
+      <w:r>
+        <w:rPr>
+          <w:lang w:val="en-US"/>
+        </w:rPr>
+        <w:t xml:space="preserve">. </w:t>
       </w:r>
       <w:r>
         <w:rPr>
@@ -783,7 +837,19 @@
         <w:rPr>
           <w:lang w:val="en-US"/>
         </w:rPr>
-        <w:t xml:space="preserve"> adapted two different ultra-brief therapeutic interventions designed to decrease distress from Luciano et al. (2011). Briefly, these defined the distinction condition, in which participants were instructed to attempt to see their thoughts and feelings as distinct from their sense of self (i.e., you are not your thoughts), versus the hierarchy condition, in which participants were instructed to attempt to see their thoughts and feelings as contained by an overarching self of self (i.e., you contain your thoughts). </w:t>
+        <w:t xml:space="preserve"> adapted two different ultra-brief therapeutic interventions designed to decrease distress from Luciano et al. (2011). Briefly, these defined the distinction condition, in which participants were instructed to attempt to see their thoughts and feelings as distinct from their sense of self (i.e., you are not your thoughts), versus the hierarchy condition, in which participants were instructed to attempt to see their thoughts and feelings as contained by an overarching </w:t>
+      </w:r>
+      <w:r>
+        <w:rPr>
+          <w:lang w:val="en-US"/>
+        </w:rPr>
+        <w:t>sense</w:t>
+      </w:r>
+      <w:r>
+        <w:rPr>
+          <w:lang w:val="en-US"/>
+        </w:rPr>
+        <w:t xml:space="preserve"> of self (i.e., you contain your thoughts). </w:t>
       </w:r>
     </w:p>
     <w:p>
@@ -1901,14 +1967,35 @@
           <w:rStyle w:val="citation"/>
           <w:lang w:val="en-US"/>
         </w:rPr>
-        <w:t xml:space="preserve"> cites both Foody et al. (2013) and Foody et al. (2015) as an illustrative example of the link between RFT and ACT. However, they do not </w:t>
+        <w:t xml:space="preserve"> cites both Foody et al. (2013) and Foody et al. (2015) as an illustrative example of the link between RFT and ACT. However, they </w:t>
       </w:r>
       <w:r>
         <w:rPr>
           <w:rStyle w:val="citation"/>
           <w:lang w:val="en-US"/>
         </w:rPr>
-        <w:t xml:space="preserve">either interrogate the strength of the evidence or </w:t>
+        <w:t>n</w:t>
+      </w:r>
+      <w:r>
+        <w:rPr>
+          <w:rStyle w:val="citation"/>
+          <w:lang w:val="en-US"/>
+        </w:rPr>
+        <w:t xml:space="preserve">either interrogate the strength of the evidence </w:t>
+      </w:r>
+      <w:r>
+        <w:rPr>
+          <w:rStyle w:val="citation"/>
+          <w:lang w:val="en-US"/>
+        </w:rPr>
+        <w:t>n</w:t>
+      </w:r>
+      <w:r>
+        <w:rPr>
+          <w:rStyle w:val="citation"/>
+          <w:lang w:val="en-US"/>
+        </w:rPr>
+        <w:t xml:space="preserve">or </w:t>
       </w:r>
       <w:r>
         <w:rPr>
@@ -2258,7 +2345,44 @@
         <w:rPr>
           <w:lang w:val="en-US"/>
         </w:rPr>
-        <w:t xml:space="preserve"> Unfortunately, recent research has demonstrated that such inaccurate and biased citations are surprisingly common in the psychology literature, with roughly 9% of all citations checked grossly misrepresenting the original work (REF). </w:t>
+        <w:t xml:space="preserve"> Unfortunately, recent research has demonstrated that such inaccurate and biased citations are surprisingly common in the psychology literature, with roughly 9% of all citations checked grossly misrepresenting the original work </w:t>
+      </w:r>
+      <w:r>
+        <w:rPr>
+          <w:lang w:val="en-US"/>
+        </w:rPr>
+        <w:fldChar w:fldCharType="begin"/>
+      </w:r>
+      <w:r>
+        <w:rPr>
+          <w:lang w:val="en-US"/>
+        </w:rPr>
+        <w:instrText xml:space="preserve"> ADDIN ZOTERO_ITEM CSL_CITATION {"citationID":"ECPDYpdq","properties":{"formattedCitation":"(Cobb et al., 2023)","plainCitation":"(Cobb et al., 2023)","noteIndex":0},"citationItems":[{"id":132,"uris":["http://zotero.org/users/1687755/items/Q7RGQKFV"],"itemData":{"id":132,"type":"article-journal","abstract":"Scholarly citation represents one of the most common and essential elements of psychological science, from publishing research, to writing grant proposals, to presenting research at academic conferences. However, when authors mischaracterize prior research findings in their studies, such instances of miscitation call into question the reliability and credibility of scholarship within psychological science and can harm theory development, evidence-based practices, knowledge growth, and public trust in psychology as a legitimate science. Despite these implications, almost no research has considered the prevalence of miscitation in the psychological literature. In the largest study to date, we compared the accuracy of 3,347 citing claims to original findings across 89 articles in eight of top psychology journals. Results indicated that, although most (81.2%) citations were accurate, roughly 19% of citing claims either failed to include important nuances of results (9.3%) or completely mischaracterized findings from prior research altogether (9.5%). Moreover, the degree of miscitation did not depend on the number of authors on an article or the seniority of the first authors. Overall, results indicate that approximately one in every 10 citations completely mischaracterizes prior research in leading psychology journals. We offer five recommendations to help authors ensure that they cite prior research accurately. (PsycInfo Database Record (c) 2023 APA, all rights reserved)","container-title":"American Psychologist","DOI":"10.1037/amp0001138","ISSN":"1935-990X","note":"publisher-place: US\npublisher: American Psychological Association","page":"No Pagination Specified-No Pagination Specified","source":"APA PsycNet","title":"The problem of miscitation in psychological science: Righting the ship","title-short":"The problem of miscitation in psychological science","author":[{"family":"Cobb","given":"Cory L."},{"family":"Crumly","given":"Brianna"},{"family":"Montero-Zamora","given":"Pablo"},{"family":"Schwartz","given":"Seth J."},{"family":"Martínez Jr.","given":"Charles R."}],"issued":{"date-parts":[["2023"]]}}}],"schema":"https://github.com/citation-style-language/schema/raw/master/csl-citation.json"} </w:instrText>
+      </w:r>
+      <w:r>
+        <w:rPr>
+          <w:lang w:val="en-US"/>
+        </w:rPr>
+        <w:fldChar w:fldCharType="separate"/>
+      </w:r>
+      <w:r>
+        <w:rPr>
+          <w:noProof/>
+          <w:lang w:val="en-US"/>
+        </w:rPr>
+        <w:t>(Cobb et al., 2023)</w:t>
+      </w:r>
+      <w:r>
+        <w:rPr>
+          <w:lang w:val="en-US"/>
+        </w:rPr>
+        <w:fldChar w:fldCharType="end"/>
+      </w:r>
+      <w:r>
+        <w:rPr>
+          <w:lang w:val="en-US"/>
+        </w:rPr>
+        <w:t xml:space="preserve">. </w:t>
       </w:r>
     </w:p>
     <w:p>
@@ -2662,7 +2786,19 @@
         <w:rPr>
           <w:lang w:val="en-US"/>
         </w:rPr>
-        <w:t xml:space="preserve">required participant to indicated </w:t>
+        <w:t>required participant</w:t>
+      </w:r>
+      <w:r>
+        <w:rPr>
+          <w:lang w:val="en-US"/>
+        </w:rPr>
+        <w:t>s</w:t>
+      </w:r>
+      <w:r>
+        <w:rPr>
+          <w:lang w:val="en-US"/>
+        </w:rPr>
+        <w:t xml:space="preserve"> to indicated </w:t>
       </w:r>
       <w:r>
         <w:rPr>
@@ -2889,13 +3025,19 @@
         <w:rPr>
           <w:lang w:val="en-US"/>
         </w:rPr>
-        <w:t>as</w:t>
+        <w:t>is</w:t>
       </w:r>
       <w:r>
         <w:rPr>
           <w:lang w:val="en-US"/>
         </w:rPr>
         <w:t xml:space="preserve"> more effective than the “distinction self as context” intervention</w:t>
+      </w:r>
+      <w:r>
+        <w:rPr>
+          <w:lang w:val="en-US"/>
+        </w:rPr>
+        <w:t xml:space="preserve"> at reducing distress</w:t>
       </w:r>
       <w:r>
         <w:rPr>
@@ -3122,11 +3264,14 @@
         <w:t xml:space="preserve"> </w:t>
       </w:r>
       <w:r>
+        <w:t xml:space="preserve">This implies that all three outcomes </w:t>
+      </w:r>
+      <w:r>
         <w:rPr>
           <w:rStyle w:val="citation"/>
           <w:lang w:val="en-US"/>
         </w:rPr>
-        <w:t>I understand this last quote as stating that all three outcomes showed descriptive differences in the expected direction, although only stress was statistically significant.</w:t>
+        <w:t>showed descriptive differences in the expected direction, although only stress was statistically significant.</w:t>
       </w:r>
     </w:p>
     <w:p>
@@ -3358,7 +3503,19 @@
         <w:rPr>
           <w:lang w:val="en-US"/>
         </w:rPr>
-        <w:t xml:space="preserve">but were not acknowledged in Foody et al. (2013), including the sample, design, number of follow up period, outcome measures, and analytic strategy </w:t>
+        <w:t>but were not acknowledged in Foody et al. (2013), including the sample, design, number of follow up period</w:t>
+      </w:r>
+      <w:r>
+        <w:rPr>
+          <w:lang w:val="en-US"/>
+        </w:rPr>
+        <w:t>s</w:t>
+      </w:r>
+      <w:r>
+        <w:rPr>
+          <w:lang w:val="en-US"/>
+        </w:rPr>
+        <w:t xml:space="preserve">, outcome measures, and analytic strategy </w:t>
       </w:r>
       <w:r>
         <w:rPr>
@@ -4338,7 +4495,19 @@
         <w:rPr>
           <w:lang w:val="en-US"/>
         </w:rPr>
-        <w:t>). However, neither study’s method section includes any reference to a car accident. The distress induction procedure in both is stated to be requiring the participant to write out a negative self-referential thought. One possibility is that text from a different study was erroneously copied into the wrong manuscripts. For example, a previous publication by Foody et al. (2012) compare</w:t>
+        <w:t>). However, neither study’s method section includes any reference to a car accident. The distress induction procedure in both is stated to be requiring the participant to write out a negative self-referential thought. One possibility is that text from a different study was erroneously cop</w:t>
+      </w:r>
+      <w:r>
+        <w:rPr>
+          <w:lang w:val="en-US"/>
+        </w:rPr>
+        <w:t>y-pasted</w:t>
+      </w:r>
+      <w:r>
+        <w:rPr>
+          <w:lang w:val="en-US"/>
+        </w:rPr>
+        <w:t xml:space="preserve"> into the wrong manuscripts. For example, a previous publication by Foody et al. (2012) compare</w:t>
       </w:r>
       <w:r>
         <w:rPr>
@@ -4368,7 +4537,33 @@
         <w:rPr>
           <w:lang w:val="en-US"/>
         </w:rPr>
-        <w:t xml:space="preserve">Another possibility is that the induction did not occur as stated in the texts. </w:t>
+        <w:t>Another possibility is that the induction did not occur as stated in the texts</w:t>
+      </w:r>
+      <w:r>
+        <w:rPr>
+          <w:lang w:val="en-US"/>
+        </w:rPr>
+        <w:t xml:space="preserve"> of Foody et al. (2013, 2015</w:t>
+      </w:r>
+      <w:proofErr w:type="gramStart"/>
+      <w:r>
+        <w:rPr>
+          <w:lang w:val="en-US"/>
+        </w:rPr>
+        <w:t>), and</w:t>
+      </w:r>
+      <w:proofErr w:type="gramEnd"/>
+      <w:r>
+        <w:rPr>
+          <w:lang w:val="en-US"/>
+        </w:rPr>
+        <w:t xml:space="preserve"> did in fact use the car crash induction from Foody et al. (2012)</w:t>
+      </w:r>
+      <w:r>
+        <w:rPr>
+          <w:lang w:val="en-US"/>
+        </w:rPr>
+        <w:t xml:space="preserve">. </w:t>
       </w:r>
       <w:r>
         <w:rPr>
@@ -4438,7 +4633,19 @@
         <w:rPr>
           <w:lang w:val="en-US"/>
         </w:rPr>
-        <w:t xml:space="preserve">Control conditions are of course needed to determine casualty within an experimental approach. </w:t>
+        <w:t xml:space="preserve">Control conditions are of course needed to determine </w:t>
+      </w:r>
+      <w:r>
+        <w:rPr>
+          <w:lang w:val="en-US"/>
+        </w:rPr>
+        <w:t>causality</w:t>
+      </w:r>
+      <w:r>
+        <w:rPr>
+          <w:lang w:val="en-US"/>
+        </w:rPr>
+        <w:t xml:space="preserve"> within an experimental approach. </w:t>
       </w:r>
       <w:r>
         <w:rPr>
@@ -4496,13 +4703,13 @@
         <w:rPr>
           <w:lang w:val="en-US"/>
         </w:rPr>
-        <w:t xml:space="preserve"> be able to differentiate between any change in mood due to the intervention vs. due to natural improvement over time, a negative control </w:t>
-      </w:r>
-      <w:r>
-        <w:rPr>
-          <w:lang w:val="en-US"/>
-        </w:rPr>
-        <w:t xml:space="preserve">condition is needed (i.e., where participants are given no intervention). </w:t>
+        <w:t xml:space="preserve"> be able to differentiate between any change in mood due to the intervention vs. due to </w:t>
+      </w:r>
+      <w:r>
+        <w:rPr>
+          <w:lang w:val="en-US"/>
+        </w:rPr>
+        <w:t xml:space="preserve">natural improvement over time, a negative control condition is needed (i.e., where participants are given no intervention). </w:t>
       </w:r>
     </w:p>
     <w:p>
@@ -4598,7 +4805,19 @@
         <w:rPr>
           <w:lang w:val="en-US"/>
         </w:rPr>
-        <w:t xml:space="preserve">This is not case of “hindsight is 20/20” or a post hoc call </w:t>
+        <w:t xml:space="preserve">This is not </w:t>
+      </w:r>
+      <w:r>
+        <w:rPr>
+          <w:lang w:val="en-US"/>
+        </w:rPr>
+        <w:t xml:space="preserve">a </w:t>
+      </w:r>
+      <w:r>
+        <w:rPr>
+          <w:lang w:val="en-US"/>
+        </w:rPr>
+        <w:t xml:space="preserve">case of “hindsight is 20/20” or a post hoc call </w:t>
       </w:r>
       <w:r>
         <w:rPr>
@@ -4808,20 +5027,20 @@
         <w:rPr>
           <w:lang w:val="en-US"/>
         </w:rPr>
-        <w:t>(two minutes) in the absence of any intervention</w:t>
-      </w:r>
-      <w:r>
-        <w:rPr>
-          <w:lang w:val="en-US"/>
-        </w:rPr>
-        <w:t xml:space="preserve"> (Rachman et al., </w:t>
+        <w:t xml:space="preserve">(two minutes) </w:t>
       </w:r>
       <w:r>
         <w:rPr>
           <w:lang w:val="en-US"/>
         </w:rPr>
         <w:lastRenderedPageBreak/>
-        <w:t xml:space="preserve">1996: Hedges’ </w:t>
+        <w:t>in the absence of any intervention</w:t>
+      </w:r>
+      <w:r>
+        <w:rPr>
+          <w:lang w:val="en-US"/>
+        </w:rPr>
+        <w:t xml:space="preserve"> (Rachman et al., 1996: Hedges’ </w:t>
       </w:r>
       <m:oMath>
         <m:sSub>
@@ -4937,13 +5156,93 @@
         <w:rPr>
           <w:lang w:val="en-US"/>
         </w:rPr>
-        <w:t>across timepoints can be seen</w:t>
-      </w:r>
-      <w:r>
-        <w:rPr>
-          <w:lang w:val="en-US"/>
-        </w:rPr>
-        <w:t>: a baseline participants demonstrate low anxiety, at postinduction it is higher, and at post</w:t>
+        <w:t xml:space="preserve">across timepoints can be </w:t>
+      </w:r>
+      <w:proofErr w:type="gramStart"/>
+      <w:r>
+        <w:rPr>
+          <w:lang w:val="en-US"/>
+        </w:rPr>
+        <w:t>seen</w:t>
+      </w:r>
+      <w:r>
+        <w:rPr>
+          <w:lang w:val="en-US"/>
+        </w:rPr>
+        <w:t>:</w:t>
+      </w:r>
+      <w:proofErr w:type="gramEnd"/>
+      <w:r>
+        <w:rPr>
+          <w:lang w:val="en-US"/>
+        </w:rPr>
+        <w:t xml:space="preserve"> participants demonstrate low anxiety</w:t>
+      </w:r>
+      <w:r>
+        <w:rPr>
+          <w:lang w:val="en-US"/>
+        </w:rPr>
+        <w:t xml:space="preserve"> </w:t>
+      </w:r>
+      <w:r>
+        <w:rPr>
+          <w:lang w:val="en-US"/>
+        </w:rPr>
+        <w:t>a</w:t>
+      </w:r>
+      <w:r>
+        <w:rPr>
+          <w:lang w:val="en-US"/>
+        </w:rPr>
+        <w:t>t</w:t>
+      </w:r>
+      <w:r>
+        <w:rPr>
+          <w:lang w:val="en-US"/>
+        </w:rPr>
+        <w:t xml:space="preserve"> baseline</w:t>
+      </w:r>
+      <w:r>
+        <w:rPr>
+          <w:lang w:val="en-US"/>
+        </w:rPr>
+        <w:t>;</w:t>
+      </w:r>
+      <w:r>
+        <w:rPr>
+          <w:lang w:val="en-US"/>
+        </w:rPr>
+        <w:t xml:space="preserve"> </w:t>
+      </w:r>
+      <w:r>
+        <w:rPr>
+          <w:lang w:val="en-US"/>
+        </w:rPr>
+        <w:t>anxiety was</w:t>
+      </w:r>
+      <w:r>
+        <w:rPr>
+          <w:lang w:val="en-US"/>
+        </w:rPr>
+        <w:t xml:space="preserve"> higher</w:t>
+      </w:r>
+      <w:r>
+        <w:rPr>
+          <w:lang w:val="en-US"/>
+        </w:rPr>
+        <w:t xml:space="preserve"> </w:t>
+      </w:r>
+      <w:r>
+        <w:rPr>
+          <w:lang w:val="en-US"/>
+        </w:rPr>
+        <w:t>at postinduction</w:t>
+      </w:r>
+      <w:r>
+        <w:rPr>
+          <w:lang w:val="en-US"/>
+        </w:rPr>
+        <w:t>, and at post</w:t>
       </w:r>
       <w:r>
         <w:rPr>
@@ -5442,14 +5741,14 @@
           <w:rStyle w:val="highlight"/>
           <w:lang w:val="en-US"/>
         </w:rPr>
-        <w:t xml:space="preserve">Foody et al. (2013) therefore make a disjoint claim, where the alternative </w:t>
+        <w:t xml:space="preserve">Foody et al. (2013) </w:t>
       </w:r>
       <w:r>
         <w:rPr>
           <w:rStyle w:val="highlight"/>
           <w:lang w:val="en-US"/>
         </w:rPr>
-        <w:t xml:space="preserve">hypothesis is accepted </w:t>
+        <w:t xml:space="preserve">therefore make a disjoint claim, where the alternative hypothesis is accepted </w:t>
       </w:r>
       <w:proofErr w:type="gramStart"/>
       <w:r>
@@ -5957,14 +6256,14 @@
         <w:rPr>
           <w:lang w:val="en-US"/>
         </w:rPr>
-        <w:t xml:space="preserve"> support their claim, an elaborated or alternative analytic strategy would be needed. For example, post hoc contrasts could have been used to test for differences in means between the groups at each time points; or to differences in means at the post-intervention time point could have simply been assessed </w:t>
+        <w:t xml:space="preserve"> support their claim, an elaborated or alternative analytic strategy would be needed. For example, post hoc contrasts could have been used to test for differences in means between the groups at each time points; or to differences in means at the post-</w:t>
       </w:r>
       <w:r>
         <w:rPr>
           <w:lang w:val="en-US"/>
         </w:rPr>
         <w:lastRenderedPageBreak/>
-        <w:t xml:space="preserve">via a </w:t>
+        <w:t xml:space="preserve">intervention time point could have simply been assessed via a </w:t>
       </w:r>
       <w:r>
         <w:rPr>
@@ -6189,7 +6488,19 @@
         <w:rPr>
           <w:lang w:val="en-US"/>
         </w:rPr>
-        <w:t xml:space="preserve">Of course, data analysis involves multiple decisions, each of which may have more than one plausible and defendable choice. In order to understand the robustness of conclusions across multiple plausible choices, the concept of “multiverse analyses” </w:t>
+        <w:t xml:space="preserve">Of course, data analysis involves multiple decisions, each of which may have more than one plausible and defendable choice. In order to understand the robustness of conclusions across multiple plausible choices, </w:t>
+      </w:r>
+      <w:r>
+        <w:rPr>
+          <w:lang w:val="en-US"/>
+        </w:rPr>
+        <w:t xml:space="preserve">I employed a </w:t>
+      </w:r>
+      <w:r>
+        <w:rPr>
+          <w:lang w:val="en-US"/>
+        </w:rPr>
+        <w:t xml:space="preserve">multiverse analyses </w:t>
       </w:r>
       <w:r>
         <w:rPr>
@@ -6578,19 +6889,19 @@
         <w:rPr>
           <w:lang w:val="en-US"/>
         </w:rPr>
-        <w:t xml:space="preserve">Results for both the distinction and hierarchy conditions were extracted from Foody et al. (2013). I also extracted results for the same two conditions that were replicated in Foody et al. (2015). The two additional conditions included in Foody et al. (2015: i.e., object-distinction and object-hierarchy) were not extracted, as I focused only on the effects that were replicated. </w:t>
-      </w:r>
-      <w:r>
-        <w:rPr>
-          <w:lang w:val="en-US"/>
-        </w:rPr>
-        <w:t xml:space="preserve">Similarly, although Foody et al. (2015) </w:t>
-      </w:r>
-      <w:r>
-        <w:rPr>
-          <w:lang w:val="en-US"/>
-        </w:rPr>
-        <w:t xml:space="preserve">employed a second cycle of distress induction and intervention, I examined only the first phase of distress induction and intervention that replicated what was done in Foody et al. (2013). </w:t>
+        <w:t xml:space="preserve">Results for both the distinction and hierarchy conditions were extracted from Foody et al. (2013). I also extracted results for the same two conditions that were replicated in Foody et al. (2015). The two additional conditions included in Foody et al. (2015: i.e., object-distinction and object-hierarchy) were not extracted, as I focused only on the effects that were </w:t>
+      </w:r>
+      <w:r>
+        <w:rPr>
+          <w:lang w:val="en-US"/>
+        </w:rPr>
+        <w:t xml:space="preserve">replicated. </w:t>
+      </w:r>
+      <w:r>
+        <w:rPr>
+          <w:lang w:val="en-US"/>
+        </w:rPr>
+        <w:t xml:space="preserve">Similarly, although Foody et al. (2015) employed a second cycle of distress induction and intervention, I examined only the first phase of distress induction and intervention that replicated what was done in Foody et al. (2013). </w:t>
       </w:r>
     </w:p>
     <w:p>
@@ -6615,7 +6926,19 @@
         <w:rPr>
           <w:lang w:val="en-US"/>
         </w:rPr>
-        <w:t xml:space="preserve">Foody et al., 1013, </w:t>
+        <w:t xml:space="preserve">Foody et al., </w:t>
+      </w:r>
+      <w:r>
+        <w:rPr>
+          <w:lang w:val="en-US"/>
+        </w:rPr>
+        <w:t>2</w:t>
+      </w:r>
+      <w:r>
+        <w:rPr>
+          <w:lang w:val="en-US"/>
+        </w:rPr>
+        <w:t xml:space="preserve">013, </w:t>
       </w:r>
       <w:r>
         <w:rPr>
@@ -6813,7 +7136,19 @@
         <w:rPr>
           <w:lang w:val="en-US"/>
         </w:rPr>
-        <w:t xml:space="preserve"> calculated in two different way to validate them against one another: using the mean for that </w:t>
+        <w:t xml:space="preserve"> calculated in two different way</w:t>
+      </w:r>
+      <w:r>
+        <w:rPr>
+          <w:lang w:val="en-US"/>
+        </w:rPr>
+        <w:t>s</w:t>
+      </w:r>
+      <w:r>
+        <w:rPr>
+          <w:lang w:val="en-US"/>
+        </w:rPr>
+        <w:t xml:space="preserve"> to validate them against one another: using the mean for that </w:t>
       </w:r>
       <w:r>
         <w:rPr>
@@ -6905,7 +7240,19 @@
         <w:rPr>
           <w:lang w:val="en-US"/>
         </w:rPr>
-        <w:t xml:space="preserve">s reported in text. Both results produced estimate that were all less than ±0.6 (on a 0 to 100 scale), suggesting that the extracted estimates are very close to the values used to generate the plots. </w:t>
+        <w:t>s reported in text. Both results produced estimate</w:t>
+      </w:r>
+      <w:r>
+        <w:rPr>
+          <w:lang w:val="en-US"/>
+        </w:rPr>
+        <w:t>s</w:t>
+      </w:r>
+      <w:r>
+        <w:rPr>
+          <w:lang w:val="en-US"/>
+        </w:rPr>
+        <w:t xml:space="preserve"> that were all less than ±0.6 (on a 0 to 100 scale), suggesting that the extracted estimates are very close to the values used to generate the plots. </w:t>
       </w:r>
       <w:r>
         <w:rPr>
@@ -6971,26 +7318,25 @@
         <w:rPr>
           <w:lang w:val="en-US"/>
         </w:rPr>
-        <w:t xml:space="preserve"> obtained via </w:t>
-      </w:r>
-      <w:r>
-        <w:rPr>
-          <w:lang w:val="en-US"/>
-        </w:rPr>
-        <w:t xml:space="preserve">the </w:t>
-      </w:r>
-      <w:r>
-        <w:rPr>
-          <w:highlight w:val="green"/>
-          <w:lang w:val="en-US"/>
-        </w:rPr>
-        <w:t>XXX</w:t>
-      </w:r>
-      <w:r>
-        <w:rPr>
-          <w:lang w:val="en-US"/>
-        </w:rPr>
-        <w:t xml:space="preserve"> method for the </w:t>
+        <w:t xml:space="preserve"> </w:t>
+      </w:r>
+      <w:r>
+        <w:rPr>
+          <w:lang w:val="en-US"/>
+        </w:rPr>
+        <w:t>extracted from the plot</w:t>
+      </w:r>
+      <w:r>
+        <w:rPr>
+          <w:lang w:val="en-US"/>
+        </w:rPr>
+        <w:t>s</w:t>
+      </w:r>
+      <w:r>
+        <w:rPr>
+          <w:lang w:val="en-US"/>
+        </w:rPr>
+        <w:t xml:space="preserve"> for the </w:t>
       </w:r>
       <w:proofErr w:type="spellStart"/>
       <w:r>
@@ -7091,7 +7437,25 @@
         <w:rPr>
           <w:lang w:val="en-US"/>
         </w:rPr>
-        <w:t xml:space="preserve">using the below equation. </w:t>
+        <w:t>using E</w:t>
+      </w:r>
+      <w:r>
+        <w:rPr>
+          <w:lang w:val="en-US"/>
+        </w:rPr>
+        <w:t>quation</w:t>
+      </w:r>
+      <w:r>
+        <w:rPr>
+          <w:lang w:val="en-US"/>
+        </w:rPr>
+        <w:t xml:space="preserve"> 2</w:t>
+      </w:r>
+      <w:r>
+        <w:rPr>
+          <w:lang w:val="en-US"/>
+        </w:rPr>
+        <w:t xml:space="preserve">. </w:t>
       </w:r>
       <w:r>
         <w:rPr>
@@ -7233,27 +7597,6 @@
     </w:p>
     <w:p>
       <w:pPr>
-        <w:rPr>
-          <w:lang w:val="en-US"/>
-        </w:rPr>
-      </w:pPr>
-      <w:proofErr w:type="gramStart"/>
-      <w:r>
-        <w:rPr>
-          <w:lang w:val="en-US"/>
-        </w:rPr>
-        <w:t>In order to</w:t>
-      </w:r>
-      <w:proofErr w:type="gramEnd"/>
-      <w:r>
-        <w:rPr>
-          <w:lang w:val="en-US"/>
-        </w:rPr>
-        <w:t xml:space="preserve"> compare differences between the distinction and hierarchy conditions at the post-intervention time point, while also acknowledging that there may be legitimate analytic </w:t>
-      </w:r>
-    </w:p>
-    <w:p>
-      <w:pPr>
         <w:pStyle w:val="Heading3"/>
         <w:rPr>
           <w:lang w:val="en-US"/>
@@ -7410,7 +7753,31 @@
         <w:rPr>
           <w:lang w:val="en-US"/>
         </w:rPr>
-        <w:t xml:space="preserve">) using the below equations. </w:t>
+        <w:t xml:space="preserve">) using </w:t>
+      </w:r>
+      <w:r>
+        <w:rPr>
+          <w:lang w:val="en-US"/>
+        </w:rPr>
+        <w:t>E</w:t>
+      </w:r>
+      <w:r>
+        <w:rPr>
+          <w:lang w:val="en-US"/>
+        </w:rPr>
+        <w:t>quations</w:t>
+      </w:r>
+      <w:r>
+        <w:rPr>
+          <w:lang w:val="en-US"/>
+        </w:rPr>
+        <w:t xml:space="preserve"> 3-5</w:t>
+      </w:r>
+      <w:r>
+        <w:rPr>
+          <w:lang w:val="en-US"/>
+        </w:rPr>
+        <w:t xml:space="preserve">. </w:t>
       </w:r>
     </w:p>
     <w:p>
@@ -7629,6 +7996,16 @@
     <w:p>
       <w:pPr>
         <w:pStyle w:val="eq"/>
+        <w:ind w:firstLine="0"/>
+        <w:rPr>
+          <w:rFonts w:ascii="CMU Serif Roman" w:hAnsi="CMU Serif Roman"/>
+          <w:lang w:val="en-US"/>
+        </w:rPr>
+      </w:pPr>
+    </w:p>
+    <w:p>
+      <w:pPr>
+        <w:pStyle w:val="eq"/>
         <w:rPr>
           <w:rFonts w:ascii="CMU Serif Roman" w:hAnsi="CMU Serif Roman"/>
           <w:lang w:val="en-US"/>
@@ -7636,88 +8013,122 @@
       </w:pPr>
       <m:oMathPara>
         <m:oMath>
-          <m:r>
-            <w:rPr>
-              <w:lang w:val="en-US"/>
-            </w:rPr>
-            <w:lastRenderedPageBreak/>
-            <m:t>t=</m:t>
-          </m:r>
-          <m:f>
-            <m:fPr>
+          <m:eqArr>
+            <m:eqArrPr>
+              <m:maxDist m:val="1"/>
               <m:ctrlPr>
                 <w:rPr>
                   <w:lang w:val="en-US"/>
                 </w:rPr>
               </m:ctrlPr>
-            </m:fPr>
-            <m:num>
-              <m:sSub>
-                <m:sSubPr>
+            </m:eqArrPr>
+            <m:e>
+              <m:r>
+                <w:rPr>
+                  <w:lang w:val="en-US"/>
+                </w:rPr>
+                <m:t xml:space="preserve">t= </m:t>
+              </m:r>
+              <m:f>
+                <m:fPr>
                   <m:ctrlPr>
                     <w:rPr>
                       <w:lang w:val="en-US"/>
                     </w:rPr>
                   </m:ctrlPr>
-                </m:sSubPr>
+                </m:fPr>
+                <m:num>
+                  <m:sSub>
+                    <m:sSubPr>
+                      <m:ctrlPr>
+                        <w:rPr>
+                          <w:lang w:val="en-US"/>
+                        </w:rPr>
+                      </m:ctrlPr>
+                    </m:sSubPr>
+                    <m:e>
+                      <m:r>
+                        <w:rPr>
+                          <w:lang w:val="en-US"/>
+                        </w:rPr>
+                        <m:t>M</m:t>
+                      </m:r>
+                    </m:e>
+                    <m:sub>
+                      <m:r>
+                        <w:rPr>
+                          <w:lang w:val="en-US"/>
+                        </w:rPr>
+                        <m:t>1</m:t>
+                      </m:r>
+                    </m:sub>
+                  </m:sSub>
+                  <m:r>
+                    <w:rPr>
+                      <w:lang w:val="en-US"/>
+                    </w:rPr>
+                    <m:t xml:space="preserve">- </m:t>
+                  </m:r>
+                  <m:sSub>
+                    <m:sSubPr>
+                      <m:ctrlPr>
+                        <w:rPr>
+                          <w:lang w:val="en-US"/>
+                        </w:rPr>
+                      </m:ctrlPr>
+                    </m:sSubPr>
+                    <m:e>
+                      <m:r>
+                        <w:rPr>
+                          <w:lang w:val="en-US"/>
+                        </w:rPr>
+                        <m:t>M</m:t>
+                      </m:r>
+                    </m:e>
+                    <m:sub>
+                      <m:r>
+                        <w:rPr>
+                          <w:lang w:val="en-US"/>
+                        </w:rPr>
+                        <m:t>2</m:t>
+                      </m:r>
+                    </m:sub>
+                  </m:sSub>
+                </m:num>
+                <m:den>
+                  <m:r>
+                    <w:rPr>
+                      <w:lang w:val="en-US"/>
+                    </w:rPr>
+                    <m:t>SE</m:t>
+                  </m:r>
+                </m:den>
+              </m:f>
+              <m:r>
+                <w:rPr>
+                  <w:lang w:val="en-US"/>
+                </w:rPr>
+                <m:t>#</m:t>
+              </m:r>
+              <m:d>
+                <m:dPr>
+                  <m:ctrlPr>
+                    <w:rPr>
+                      <w:lang w:val="en-US"/>
+                    </w:rPr>
+                  </m:ctrlPr>
+                </m:dPr>
                 <m:e>
                   <m:r>
                     <w:rPr>
                       <w:lang w:val="en-US"/>
                     </w:rPr>
-                    <m:t>M</m:t>
+                    <m:t>4</m:t>
                   </m:r>
                 </m:e>
-                <m:sub>
-                  <m:r>
-                    <w:rPr>
-                      <w:lang w:val="en-US"/>
-                    </w:rPr>
-                    <m:t>1</m:t>
-                  </m:r>
-                </m:sub>
-              </m:sSub>
-              <m:r>
-                <w:rPr>
-                  <w:lang w:val="en-US"/>
-                </w:rPr>
-                <m:t>-</m:t>
-              </m:r>
-              <m:sSub>
-                <m:sSubPr>
-                  <m:ctrlPr>
-                    <w:rPr>
-                      <w:lang w:val="en-US"/>
-                    </w:rPr>
-                  </m:ctrlPr>
-                </m:sSubPr>
-                <m:e>
-                  <m:r>
-                    <w:rPr>
-                      <w:lang w:val="en-US"/>
-                    </w:rPr>
-                    <m:t>M</m:t>
-                  </m:r>
-                </m:e>
-                <m:sub>
-                  <m:r>
-                    <w:rPr>
-                      <w:lang w:val="en-US"/>
-                    </w:rPr>
-                    <m:t>2</m:t>
-                  </m:r>
-                </m:sub>
-              </m:sSub>
-            </m:num>
-            <m:den>
-              <m:r>
-                <w:rPr>
-                  <w:lang w:val="en-US"/>
-                </w:rPr>
-                <m:t>SE</m:t>
-              </m:r>
-            </m:den>
-          </m:f>
+              </m:d>
+            </m:e>
+          </m:eqArr>
         </m:oMath>
       </m:oMathPara>
     </w:p>
@@ -8125,7 +8536,7 @@
                     <w:rPr>
                       <w:lang w:val="en-US"/>
                     </w:rPr>
-                    <m:t>4</m:t>
+                    <m:t>5</m:t>
                   </m:r>
                 </m:e>
               </m:d>
@@ -8179,7 +8590,31 @@
         <w:rPr>
           <w:lang w:val="en-US"/>
         </w:rPr>
-        <w:t xml:space="preserve"> with a bias correction for small sample sizes, was calculated using the following equation.</w:t>
+        <w:t xml:space="preserve"> with a bias correction for small sample sizes, was calculated using </w:t>
+      </w:r>
+      <w:r>
+        <w:rPr>
+          <w:lang w:val="en-US"/>
+        </w:rPr>
+        <w:t>E</w:t>
+      </w:r>
+      <w:r>
+        <w:rPr>
+          <w:lang w:val="en-US"/>
+        </w:rPr>
+        <w:t>quation</w:t>
+      </w:r>
+      <w:r>
+        <w:rPr>
+          <w:lang w:val="en-US"/>
+        </w:rPr>
+        <w:t xml:space="preserve"> 6</w:t>
+      </w:r>
+      <w:r>
+        <w:rPr>
+          <w:lang w:val="en-US"/>
+        </w:rPr>
+        <w:t>.</w:t>
       </w:r>
     </w:p>
     <w:p>
@@ -8546,7 +8981,7 @@
                     <w:rPr>
                       <w:lang w:val="en-US"/>
                     </w:rPr>
-                    <m:t>5</m:t>
+                    <m:t>6</m:t>
                   </m:r>
                 </m:e>
               </m:d>
@@ -8810,19 +9245,19 @@
         <w:rPr>
           <w:lang w:val="en-US"/>
         </w:rPr>
-        <w:t xml:space="preserve">to treat these three ad </w:t>
-      </w:r>
-      <w:r>
-        <w:rPr>
-          <w:lang w:val="en-US"/>
-        </w:rPr>
-        <w:t xml:space="preserve">hoc measures as valid measures of a latent “distress” variable cannot be answered </w:t>
-      </w:r>
-      <w:r>
-        <w:rPr>
-          <w:lang w:val="en-US"/>
-        </w:rPr>
-        <w:t>without access to the original data (or possibly via new data collection)</w:t>
+        <w:t xml:space="preserve">to treat these three ad hoc measures as valid measures of a latent “distress” variable cannot be answered </w:t>
+      </w:r>
+      <w:r>
+        <w:rPr>
+          <w:lang w:val="en-US"/>
+        </w:rPr>
+        <w:t xml:space="preserve">without access to the </w:t>
+      </w:r>
+      <w:r>
+        <w:rPr>
+          <w:lang w:val="en-US"/>
+        </w:rPr>
+        <w:t>original data (or possibly via new data collection)</w:t>
       </w:r>
       <w:r>
         <w:rPr>
@@ -8922,7 +9357,7 @@
         <w:rPr>
           <w:lang w:val="en-US"/>
         </w:rPr>
-        <w:t xml:space="preserve">I calculated pooled means for each condition by averaging them, and pooled </w:t>
+        <w:t xml:space="preserve">calculated pooled means for each condition by averaging them, and pooled </w:t>
       </w:r>
       <w:r>
         <w:rPr>
@@ -8978,7 +9413,31 @@
         <w:rPr>
           <w:lang w:val="en-US"/>
         </w:rPr>
-        <w:t xml:space="preserve">-tests and effect sizes for both the original study and the replication. </w:t>
+        <w:t>-tests and effect sizes for both the original study and the replication</w:t>
+      </w:r>
+      <w:r>
+        <w:rPr>
+          <w:lang w:val="en-US"/>
+        </w:rPr>
+        <w:t xml:space="preserve"> using </w:t>
+      </w:r>
+      <w:r>
+        <w:rPr>
+          <w:lang w:val="en-US"/>
+        </w:rPr>
+        <w:t>E</w:t>
+      </w:r>
+      <w:r>
+        <w:rPr>
+          <w:lang w:val="en-US"/>
+        </w:rPr>
+        <w:t>quation 7</w:t>
+      </w:r>
+      <w:r>
+        <w:rPr>
+          <w:lang w:val="en-US"/>
+        </w:rPr>
+        <w:t xml:space="preserve">. </w:t>
       </w:r>
     </w:p>
     <w:p>
@@ -9202,7 +9661,7 @@
                     <w:rPr>
                       <w:lang w:val="en-US"/>
                     </w:rPr>
-                    <m:t>6</m:t>
+                    <m:t>7</m:t>
                   </m:r>
                 </m:e>
               </m:d>
@@ -9282,7 +9741,19 @@
         <w:rPr>
           <w:lang w:val="en-US"/>
         </w:rPr>
-        <w:t xml:space="preserve"> differences between conditions after an intervention is whether or not to the control for differences at baseline </w:t>
+        <w:t xml:space="preserve"> differences between conditions after an intervention is whether or not to control for </w:t>
+      </w:r>
+      <w:r>
+        <w:rPr>
+          <w:lang w:val="en-US"/>
+        </w:rPr>
+        <w:t xml:space="preserve">baseline </w:t>
+      </w:r>
+      <w:r>
+        <w:rPr>
+          <w:lang w:val="en-US"/>
+        </w:rPr>
+        <w:t xml:space="preserve">differences </w:t>
       </w:r>
       <w:r>
         <w:rPr>
@@ -9656,13 +10127,35 @@
         <w:t>2</w:t>
       </w:r>
       <w:r>
-        <w:t>. Multiverse plot for the original study</w:t>
-      </w:r>
-      <w:r>
+        <w:t xml:space="preserve">. </w:t>
+      </w:r>
+      <w:r>
+        <w:rPr>
+          <w:b w:val="0"/>
+          <w:bCs w:val="0"/>
+        </w:rPr>
+        <w:t>Multiverse plot for the original study</w:t>
+      </w:r>
+      <w:r>
+        <w:rPr>
+          <w:b w:val="0"/>
+          <w:bCs w:val="0"/>
+        </w:rPr>
         <w:t xml:space="preserve"> (Foody et al., 2013)</w:t>
       </w:r>
       <w:r>
+        <w:rPr>
+          <w:b w:val="0"/>
+          <w:bCs w:val="0"/>
+        </w:rPr>
         <w:t>.</w:t>
+      </w:r>
+      <w:r>
+        <w:rPr>
+          <w:b w:val="0"/>
+          <w:bCs w:val="0"/>
+        </w:rPr>
+        <w:t xml:space="preserve"> Error bars represent 95% Confidence Intervals.</w:t>
       </w:r>
     </w:p>
     <w:p>
@@ -9734,10 +10227,31 @@
         <w:t>3</w:t>
       </w:r>
       <w:r>
-        <w:t>. Multiverse plot for the replication study</w:t>
-      </w:r>
-      <w:r>
+        <w:t xml:space="preserve">. </w:t>
+      </w:r>
+      <w:r>
+        <w:rPr>
+          <w:b w:val="0"/>
+          <w:bCs w:val="0"/>
+        </w:rPr>
+        <w:t>Multiverse plot for the replication study</w:t>
+      </w:r>
+      <w:r>
+        <w:rPr>
+          <w:b w:val="0"/>
+          <w:bCs w:val="0"/>
+        </w:rPr>
         <w:t xml:space="preserve"> (Foody et al., 2015).</w:t>
+      </w:r>
+      <w:r>
+        <w:t xml:space="preserve"> </w:t>
+      </w:r>
+      <w:r>
+        <w:rPr>
+          <w:b w:val="0"/>
+          <w:bCs w:val="0"/>
+        </w:rPr>
+        <w:t>Error bars represent 95% Confidence Intervals.</w:t>
       </w:r>
     </w:p>
     <w:p>
@@ -10063,7 +10577,19 @@
         <w:rPr>
           <w:lang w:val="en-US"/>
         </w:rPr>
-        <w:t xml:space="preserve">between the distinction and hierarchy conditions at the post-intervention time point under any set of analytic choice in either the original study or the replication. That is, the results very robustly fail to support the original conclusion that </w:t>
+        <w:t>between the distinction and hierarchy conditions at the post-intervention time point under any set of analytic choice</w:t>
+      </w:r>
+      <w:r>
+        <w:rPr>
+          <w:lang w:val="en-US"/>
+        </w:rPr>
+        <w:t>s</w:t>
+      </w:r>
+      <w:r>
+        <w:rPr>
+          <w:lang w:val="en-US"/>
+        </w:rPr>
+        <w:t xml:space="preserve"> in either the original study or the replication. That is, the results very robustly fail to support the original conclusion that </w:t>
       </w:r>
       <w:r>
         <w:rPr>
@@ -10288,7 +10814,7 @@
         <w:rPr>
           <w:lang w:val="en-US"/>
         </w:rPr>
-        <w:t xml:space="preserve">hical relations with mental content produces superior therapeutic </w:t>
+        <w:t xml:space="preserve">hical relations with mental content produce superior therapeutic </w:t>
       </w:r>
       <w:proofErr w:type="gramStart"/>
       <w:r>
@@ -10688,14 +11214,14 @@
           <w:rFonts w:eastAsiaTheme="minorHAnsi"/>
           <w:lang w:eastAsia="en-US"/>
         </w:rPr>
-        <w:t xml:space="preserve">Derksen, M., &amp; Morawski, J. (2022). Kinds of Replication: Examining the Meanings of “Conceptual Replication” and “Direct </w:t>
-      </w:r>
-      <w:r>
-        <w:rPr>
-          <w:rFonts w:eastAsiaTheme="minorHAnsi"/>
-          <w:lang w:eastAsia="en-US"/>
-        </w:rPr>
-        <w:t xml:space="preserve">Replication.” </w:t>
+        <w:t xml:space="preserve">Cobb, C. L., Crumly, B., Montero-Zamora, P., Schwartz, S. J., &amp; Martínez Jr., C. R. (2023). The problem of miscitation in psychological </w:t>
+      </w:r>
+      <w:r>
+        <w:rPr>
+          <w:rFonts w:eastAsiaTheme="minorHAnsi"/>
+          <w:lang w:eastAsia="en-US"/>
+        </w:rPr>
+        <w:t xml:space="preserve">science: Righting the ship. </w:t>
       </w:r>
       <w:r>
         <w:rPr>
@@ -10704,14 +11230,30 @@
           <w:iCs/>
           <w:lang w:eastAsia="en-US"/>
         </w:rPr>
-        <w:t>Perspectives on Psychological Science</w:t>
-      </w:r>
-      <w:r>
-        <w:rPr>
-          <w:rFonts w:eastAsiaTheme="minorHAnsi"/>
-          <w:lang w:eastAsia="en-US"/>
-        </w:rPr>
-        <w:t xml:space="preserve">, </w:t>
+        <w:t>American Psychologist</w:t>
+      </w:r>
+      <w:r>
+        <w:rPr>
+          <w:rFonts w:eastAsiaTheme="minorHAnsi"/>
+          <w:lang w:eastAsia="en-US"/>
+        </w:rPr>
+        <w:t>, No Pagination Specified-No Pagination Specified. https://doi.org/10.1037/amp0001138</w:t>
+      </w:r>
+    </w:p>
+    <w:p>
+      <w:pPr>
+        <w:pStyle w:val="Bibliography"/>
+        <w:rPr>
+          <w:rFonts w:eastAsiaTheme="minorHAnsi"/>
+          <w:lang w:eastAsia="en-US"/>
+        </w:rPr>
+      </w:pPr>
+      <w:r>
+        <w:rPr>
+          <w:rFonts w:eastAsiaTheme="minorHAnsi"/>
+          <w:lang w:eastAsia="en-US"/>
+        </w:rPr>
+        <w:t xml:space="preserve">Derksen, M., &amp; Morawski, J. (2022). Kinds of Replication: Examining the Meanings of “Conceptual Replication” and “Direct Replication.” </w:t>
       </w:r>
       <w:r>
         <w:rPr>
@@ -10720,30 +11262,14 @@
           <w:iCs/>
           <w:lang w:eastAsia="en-US"/>
         </w:rPr>
-        <w:t>17</w:t>
-      </w:r>
-      <w:r>
-        <w:rPr>
-          <w:rFonts w:eastAsiaTheme="minorHAnsi"/>
-          <w:lang w:eastAsia="en-US"/>
-        </w:rPr>
-        <w:t>(5), 1490–1505. https://doi.org/10.1177/17456916211041116</w:t>
-      </w:r>
-    </w:p>
-    <w:p>
-      <w:pPr>
-        <w:pStyle w:val="Bibliography"/>
-        <w:rPr>
-          <w:rFonts w:eastAsiaTheme="minorHAnsi"/>
-          <w:lang w:eastAsia="en-US"/>
-        </w:rPr>
-      </w:pPr>
-      <w:r>
-        <w:rPr>
-          <w:rFonts w:eastAsiaTheme="minorHAnsi"/>
-          <w:lang w:eastAsia="en-US"/>
-        </w:rPr>
-        <w:t xml:space="preserve">Dixon, M. R., &amp; Hayes, S. C. (2022). On the Disruptive Effects of Behavior Analysis on Behavior Analysis: The High Cost of Keeping Out Acceptance and Commitment Therapy and Training. </w:t>
+        <w:t>Perspectives on Psychological Science</w:t>
+      </w:r>
+      <w:r>
+        <w:rPr>
+          <w:rFonts w:eastAsiaTheme="minorHAnsi"/>
+          <w:lang w:eastAsia="en-US"/>
+        </w:rPr>
+        <w:t xml:space="preserve">, </w:t>
       </w:r>
       <w:r>
         <w:rPr>
@@ -10752,14 +11278,14 @@
           <w:iCs/>
           <w:lang w:eastAsia="en-US"/>
         </w:rPr>
-        <w:t>Behavior Analysis in Practice</w:t>
-      </w:r>
-      <w:r>
-        <w:rPr>
-          <w:rFonts w:eastAsiaTheme="minorHAnsi"/>
-          <w:lang w:eastAsia="en-US"/>
-        </w:rPr>
-        <w:t>, 1–7. https://doi.org/10.1007/s40617-022-00742-4</w:t>
+        <w:t>17</w:t>
+      </w:r>
+      <w:r>
+        <w:rPr>
+          <w:rFonts w:eastAsiaTheme="minorHAnsi"/>
+          <w:lang w:eastAsia="en-US"/>
+        </w:rPr>
+        <w:t>(5), 1490–1505. https://doi.org/10.1177/17456916211041116</w:t>
       </w:r>
     </w:p>
     <w:p>
@@ -10775,7 +11301,7 @@
           <w:rFonts w:eastAsiaTheme="minorHAnsi"/>
           <w:lang w:eastAsia="en-US"/>
         </w:rPr>
-        <w:t xml:space="preserve">Foody, M., Barnes-Holmes, Y., Barnes-Holmes, D., &amp; Luciano, C. (2013). An Empirical Investigation of Hierarchical versus Distinction Relations in a Self-based ACT Exercise. </w:t>
+        <w:t xml:space="preserve">Dixon, M. R., &amp; Hayes, S. C. (2022). On the Disruptive Effects of Behavior Analysis on Behavior Analysis: The High Cost of Keeping Out Acceptance and Commitment Therapy and Training. </w:t>
       </w:r>
       <w:r>
         <w:rPr>
@@ -10784,14 +11310,14 @@
           <w:iCs/>
           <w:lang w:eastAsia="en-US"/>
         </w:rPr>
-        <w:t>International Journal of Psychology</w:t>
-      </w:r>
-      <w:r>
-        <w:rPr>
-          <w:rFonts w:eastAsiaTheme="minorHAnsi"/>
-          <w:lang w:eastAsia="en-US"/>
-        </w:rPr>
-        <w:t>.</w:t>
+        <w:t>Behavior Analysis in Practice</w:t>
+      </w:r>
+      <w:r>
+        <w:rPr>
+          <w:rFonts w:eastAsiaTheme="minorHAnsi"/>
+          <w:lang w:eastAsia="en-US"/>
+        </w:rPr>
+        <w:t>, 1–7. https://doi.org/10.1007/s40617-022-00742-4</w:t>
       </w:r>
     </w:p>
     <w:p>
@@ -10807,7 +11333,7 @@
           <w:rFonts w:eastAsiaTheme="minorHAnsi"/>
           <w:lang w:eastAsia="en-US"/>
         </w:rPr>
-        <w:t xml:space="preserve">Foody, M., Barnes-Holmes, Y., Barnes-Holmes, D., Rai, L., &amp; Luciano, C. (2015). An Empirical Investigation of the Role of Self, Hierarchy, and Distinction in a Common Act Exercise. </w:t>
+        <w:t xml:space="preserve">Foody, M., Barnes-Holmes, Y., Barnes-Holmes, D., &amp; Luciano, C. (2013). An Empirical Investigation of Hierarchical versus Distinction Relations in a Self-based ACT Exercise. </w:t>
       </w:r>
       <w:r>
         <w:rPr>
@@ -10816,14 +11342,30 @@
           <w:iCs/>
           <w:lang w:eastAsia="en-US"/>
         </w:rPr>
-        <w:t>The Psychological Record</w:t>
-      </w:r>
-      <w:r>
-        <w:rPr>
-          <w:rFonts w:eastAsiaTheme="minorHAnsi"/>
-          <w:lang w:eastAsia="en-US"/>
-        </w:rPr>
-        <w:t xml:space="preserve">, </w:t>
+        <w:t>International Journal of Psychology</w:t>
+      </w:r>
+      <w:r>
+        <w:rPr>
+          <w:rFonts w:eastAsiaTheme="minorHAnsi"/>
+          <w:lang w:eastAsia="en-US"/>
+        </w:rPr>
+        <w:t>.</w:t>
+      </w:r>
+    </w:p>
+    <w:p>
+      <w:pPr>
+        <w:pStyle w:val="Bibliography"/>
+        <w:rPr>
+          <w:rFonts w:eastAsiaTheme="minorHAnsi"/>
+          <w:lang w:eastAsia="en-US"/>
+        </w:rPr>
+      </w:pPr>
+      <w:r>
+        <w:rPr>
+          <w:rFonts w:eastAsiaTheme="minorHAnsi"/>
+          <w:lang w:eastAsia="en-US"/>
+        </w:rPr>
+        <w:t xml:space="preserve">Foody, M., Barnes-Holmes, Y., Barnes-Holmes, D., Rai, L., &amp; Luciano, C. (2015). An Empirical Investigation of the Role of Self, Hierarchy, and Distinction in a Common Act Exercise. </w:t>
       </w:r>
       <w:r>
         <w:rPr>
@@ -10832,30 +11374,14 @@
           <w:iCs/>
           <w:lang w:eastAsia="en-US"/>
         </w:rPr>
-        <w:t>65</w:t>
-      </w:r>
-      <w:r>
-        <w:rPr>
-          <w:rFonts w:eastAsiaTheme="minorHAnsi"/>
-          <w:lang w:eastAsia="en-US"/>
-        </w:rPr>
-        <w:t>(2), Article 2. https://doi.org/10.1007/s40732-014-0103-2</w:t>
-      </w:r>
-    </w:p>
-    <w:p>
-      <w:pPr>
-        <w:pStyle w:val="Bibliography"/>
-        <w:rPr>
-          <w:rFonts w:eastAsiaTheme="minorHAnsi"/>
-          <w:lang w:eastAsia="en-US"/>
-        </w:rPr>
-      </w:pPr>
-      <w:r>
-        <w:rPr>
-          <w:rFonts w:eastAsiaTheme="minorHAnsi"/>
-          <w:lang w:eastAsia="en-US"/>
-        </w:rPr>
-        <w:t xml:space="preserve">Gelman, A. (2016, September 21). What has happened down here is the winds have changed. </w:t>
+        <w:t>The Psychological Record</w:t>
+      </w:r>
+      <w:r>
+        <w:rPr>
+          <w:rFonts w:eastAsiaTheme="minorHAnsi"/>
+          <w:lang w:eastAsia="en-US"/>
+        </w:rPr>
+        <w:t xml:space="preserve">, </w:t>
       </w:r>
       <w:r>
         <w:rPr>
@@ -10864,14 +11390,14 @@
           <w:iCs/>
           <w:lang w:eastAsia="en-US"/>
         </w:rPr>
-        <w:t>Statistical Modeling, Causal Inference, and Social Science</w:t>
-      </w:r>
-      <w:r>
-        <w:rPr>
-          <w:rFonts w:eastAsiaTheme="minorHAnsi"/>
-          <w:lang w:eastAsia="en-US"/>
-        </w:rPr>
-        <w:t>. http://andrewgelman.com/2016/09/21/what-has-happened-down-here-is-the-winds-have-changed/</w:t>
+        <w:t>65</w:t>
+      </w:r>
+      <w:r>
+        <w:rPr>
+          <w:rFonts w:eastAsiaTheme="minorHAnsi"/>
+          <w:lang w:eastAsia="en-US"/>
+        </w:rPr>
+        <w:t>(2), Article 2. https://doi.org/10.1007/s40732-014-0103-2</w:t>
       </w:r>
     </w:p>
     <w:p>
@@ -10887,7 +11413,7 @@
           <w:rFonts w:eastAsiaTheme="minorHAnsi"/>
           <w:lang w:eastAsia="en-US"/>
         </w:rPr>
-        <w:t xml:space="preserve">Godbee, M., &amp; Kangas, M. (2022). Focusing on the self in context as an emotion regulatory strategy: An evaluation of the “self-as-context” component of ACT compared to cognitive reappraisal in managing stress. </w:t>
+        <w:t xml:space="preserve">Gelman, A. (2016, September 21). What has happened down here is the winds have changed. </w:t>
       </w:r>
       <w:r>
         <w:rPr>
@@ -10896,14 +11422,30 @@
           <w:iCs/>
           <w:lang w:eastAsia="en-US"/>
         </w:rPr>
-        <w:t>Anxiety, Stress, &amp; Coping</w:t>
-      </w:r>
-      <w:r>
-        <w:rPr>
-          <w:rFonts w:eastAsiaTheme="minorHAnsi"/>
-          <w:lang w:eastAsia="en-US"/>
-        </w:rPr>
-        <w:t xml:space="preserve">, </w:t>
+        <w:t>Statistical Modeling, Causal Inference, and Social Science</w:t>
+      </w:r>
+      <w:r>
+        <w:rPr>
+          <w:rFonts w:eastAsiaTheme="minorHAnsi"/>
+          <w:lang w:eastAsia="en-US"/>
+        </w:rPr>
+        <w:t>. http://andrewgelman.com/2016/09/21/what-has-happened-down-here-is-the-winds-have-changed/</w:t>
+      </w:r>
+    </w:p>
+    <w:p>
+      <w:pPr>
+        <w:pStyle w:val="Bibliography"/>
+        <w:rPr>
+          <w:rFonts w:eastAsiaTheme="minorHAnsi"/>
+          <w:lang w:eastAsia="en-US"/>
+        </w:rPr>
+      </w:pPr>
+      <w:r>
+        <w:rPr>
+          <w:rFonts w:eastAsiaTheme="minorHAnsi"/>
+          <w:lang w:eastAsia="en-US"/>
+        </w:rPr>
+        <w:t xml:space="preserve">Godbee, M., &amp; Kangas, M. (2022). Focusing on the self in context as an emotion regulatory strategy: An evaluation of the “self-as-context” component of ACT compared to cognitive reappraisal in managing stress. </w:t>
       </w:r>
       <w:r>
         <w:rPr>
@@ -10912,30 +11454,14 @@
           <w:iCs/>
           <w:lang w:eastAsia="en-US"/>
         </w:rPr>
-        <w:t>35</w:t>
-      </w:r>
-      <w:r>
-        <w:rPr>
-          <w:rFonts w:eastAsiaTheme="minorHAnsi"/>
-          <w:lang w:eastAsia="en-US"/>
-        </w:rPr>
-        <w:t>(5), 557–573. https://doi.org/10.1080/10615806.2021.1985472</w:t>
-      </w:r>
-    </w:p>
-    <w:p>
-      <w:pPr>
-        <w:pStyle w:val="Bibliography"/>
-        <w:rPr>
-          <w:rFonts w:eastAsiaTheme="minorHAnsi"/>
-          <w:lang w:eastAsia="en-US"/>
-        </w:rPr>
-      </w:pPr>
-      <w:r>
-        <w:rPr>
-          <w:rFonts w:eastAsiaTheme="minorHAnsi"/>
-          <w:lang w:eastAsia="en-US"/>
-        </w:rPr>
-        <w:t xml:space="preserve">Gomide, C. P., Perez, W. F., &amp; Pessôa, C. V. B. B. (2024). Perspective taking reduces the correspondence bias: A systematically replication of Hooper et al. (2015). </w:t>
+        <w:t>Anxiety, Stress, &amp; Coping</w:t>
+      </w:r>
+      <w:r>
+        <w:rPr>
+          <w:rFonts w:eastAsiaTheme="minorHAnsi"/>
+          <w:lang w:eastAsia="en-US"/>
+        </w:rPr>
+        <w:t xml:space="preserve">, </w:t>
       </w:r>
       <w:r>
         <w:rPr>
@@ -10944,14 +11470,30 @@
           <w:iCs/>
           <w:lang w:eastAsia="en-US"/>
         </w:rPr>
-        <w:t>Journal of Contextual Behavioral Science</w:t>
-      </w:r>
-      <w:r>
-        <w:rPr>
-          <w:rFonts w:eastAsiaTheme="minorHAnsi"/>
-          <w:lang w:eastAsia="en-US"/>
-        </w:rPr>
-        <w:t xml:space="preserve">, </w:t>
+        <w:t>35</w:t>
+      </w:r>
+      <w:r>
+        <w:rPr>
+          <w:rFonts w:eastAsiaTheme="minorHAnsi"/>
+          <w:lang w:eastAsia="en-US"/>
+        </w:rPr>
+        <w:t>(5), 557–573. https://doi.org/10.1080/10615806.2021.1985472</w:t>
+      </w:r>
+    </w:p>
+    <w:p>
+      <w:pPr>
+        <w:pStyle w:val="Bibliography"/>
+        <w:rPr>
+          <w:rFonts w:eastAsiaTheme="minorHAnsi"/>
+          <w:lang w:eastAsia="en-US"/>
+        </w:rPr>
+      </w:pPr>
+      <w:r>
+        <w:rPr>
+          <w:rFonts w:eastAsiaTheme="minorHAnsi"/>
+          <w:lang w:eastAsia="en-US"/>
+        </w:rPr>
+        <w:t xml:space="preserve">Gomide, C. P., Perez, W. F., &amp; Pessôa, C. V. B. B. (2024). Perspective taking reduces the correspondence bias: A systematically replication of Hooper et al. (2015). </w:t>
       </w:r>
       <w:r>
         <w:rPr>
@@ -10960,30 +11502,14 @@
           <w:iCs/>
           <w:lang w:eastAsia="en-US"/>
         </w:rPr>
-        <w:t>32</w:t>
-      </w:r>
-      <w:r>
-        <w:rPr>
-          <w:rFonts w:eastAsiaTheme="minorHAnsi"/>
-          <w:lang w:eastAsia="en-US"/>
-        </w:rPr>
-        <w:t>, 100735. https://doi.org/10.1016/j.jcbs.2024.100735</w:t>
-      </w:r>
-    </w:p>
-    <w:p>
-      <w:pPr>
-        <w:pStyle w:val="Bibliography"/>
-        <w:rPr>
-          <w:rFonts w:eastAsiaTheme="minorHAnsi"/>
-          <w:lang w:eastAsia="en-US"/>
-        </w:rPr>
-      </w:pPr>
-      <w:r>
-        <w:rPr>
-          <w:rFonts w:eastAsiaTheme="minorHAnsi"/>
-          <w:lang w:eastAsia="en-US"/>
-        </w:rPr>
-        <w:t xml:space="preserve">Hantula, D. A. (2019). Editorial: Replication and Reliability in Behavior Science and Behavior Analysis: A Call for a Conversation. </w:t>
+        <w:t>Journal of Contextual Behavioral Science</w:t>
+      </w:r>
+      <w:r>
+        <w:rPr>
+          <w:rFonts w:eastAsiaTheme="minorHAnsi"/>
+          <w:lang w:eastAsia="en-US"/>
+        </w:rPr>
+        <w:t xml:space="preserve">, </w:t>
       </w:r>
       <w:r>
         <w:rPr>
@@ -10992,14 +11518,30 @@
           <w:iCs/>
           <w:lang w:eastAsia="en-US"/>
         </w:rPr>
-        <w:t>Perspectives on Behavior Science</w:t>
-      </w:r>
-      <w:r>
-        <w:rPr>
-          <w:rFonts w:eastAsiaTheme="minorHAnsi"/>
-          <w:lang w:eastAsia="en-US"/>
-        </w:rPr>
-        <w:t xml:space="preserve">, </w:t>
+        <w:t>32</w:t>
+      </w:r>
+      <w:r>
+        <w:rPr>
+          <w:rFonts w:eastAsiaTheme="minorHAnsi"/>
+          <w:lang w:eastAsia="en-US"/>
+        </w:rPr>
+        <w:t>, 100735. https://doi.org/10.1016/j.jcbs.2024.100735</w:t>
+      </w:r>
+    </w:p>
+    <w:p>
+      <w:pPr>
+        <w:pStyle w:val="Bibliography"/>
+        <w:rPr>
+          <w:rFonts w:eastAsiaTheme="minorHAnsi"/>
+          <w:lang w:eastAsia="en-US"/>
+        </w:rPr>
+      </w:pPr>
+      <w:r>
+        <w:rPr>
+          <w:rFonts w:eastAsiaTheme="minorHAnsi"/>
+          <w:lang w:eastAsia="en-US"/>
+        </w:rPr>
+        <w:t xml:space="preserve">Hantula, D. A. (2019). Editorial: Replication and Reliability in Behavior Science and Behavior Analysis: A Call for a Conversation. </w:t>
       </w:r>
       <w:r>
         <w:rPr>
@@ -11008,30 +11550,14 @@
           <w:iCs/>
           <w:lang w:eastAsia="en-US"/>
         </w:rPr>
-        <w:t>42</w:t>
-      </w:r>
-      <w:r>
-        <w:rPr>
-          <w:rFonts w:eastAsiaTheme="minorHAnsi"/>
-          <w:lang w:eastAsia="en-US"/>
-        </w:rPr>
-        <w:t>(1), 1–11. https://doi.org/10.1007/s40614-019-00194-2</w:t>
-      </w:r>
-    </w:p>
-    <w:p>
-      <w:pPr>
-        <w:pStyle w:val="Bibliography"/>
-        <w:rPr>
-          <w:rFonts w:eastAsiaTheme="minorHAnsi"/>
-          <w:lang w:eastAsia="en-US"/>
-        </w:rPr>
-      </w:pPr>
-      <w:r>
-        <w:rPr>
-          <w:rFonts w:eastAsiaTheme="minorHAnsi"/>
-          <w:lang w:eastAsia="en-US"/>
-        </w:rPr>
-        <w:t xml:space="preserve">Harte, C., &amp; Barnes-Holmes, D. (2023). A primer on relational frame theory (RFT). In M. P. Twohig, M. E. Levin, &amp; J. M. Petersen (Eds.), </w:t>
+        <w:t>Perspectives on Behavior Science</w:t>
+      </w:r>
+      <w:r>
+        <w:rPr>
+          <w:rFonts w:eastAsiaTheme="minorHAnsi"/>
+          <w:lang w:eastAsia="en-US"/>
+        </w:rPr>
+        <w:t xml:space="preserve">, </w:t>
       </w:r>
       <w:r>
         <w:rPr>
@@ -11040,14 +11566,14 @@
           <w:iCs/>
           <w:lang w:eastAsia="en-US"/>
         </w:rPr>
-        <w:t>The Oxford Handbook of Acceptance and Commitment Therapy</w:t>
-      </w:r>
-      <w:r>
-        <w:rPr>
-          <w:rFonts w:eastAsiaTheme="minorHAnsi"/>
-          <w:lang w:eastAsia="en-US"/>
-        </w:rPr>
-        <w:t xml:space="preserve"> (1st ed.). Oxford University Press. https://doi.org/10.1093/oxfordhb/9780197550076.001.0001</w:t>
+        <w:t>42</w:t>
+      </w:r>
+      <w:r>
+        <w:rPr>
+          <w:rFonts w:eastAsiaTheme="minorHAnsi"/>
+          <w:lang w:eastAsia="en-US"/>
+        </w:rPr>
+        <w:t>(1), 1–11. https://doi.org/10.1007/s40614-019-00194-2</w:t>
       </w:r>
     </w:p>
     <w:p>
@@ -11063,7 +11589,7 @@
           <w:rFonts w:eastAsiaTheme="minorHAnsi"/>
           <w:lang w:eastAsia="en-US"/>
         </w:rPr>
-        <w:t xml:space="preserve">Hulbert-Williams, L., Pendrous, R., Hochard, K. D., &amp; Hulbert-Williams, N. J. (2020). In search of scope: A response to Ruiz et al. (2020). </w:t>
+        <w:t xml:space="preserve">Harte, C., &amp; Barnes-Holmes, D. (2023). A primer on relational frame theory (RFT). In M. P. Twohig, M. E. Levin, &amp; J. M. Petersen (Eds.), </w:t>
       </w:r>
       <w:r>
         <w:rPr>
@@ -11072,14 +11598,14 @@
           <w:iCs/>
           <w:lang w:eastAsia="en-US"/>
         </w:rPr>
-        <w:t>Journal of Contextual Behavioral Science</w:t>
-      </w:r>
-      <w:r>
-        <w:rPr>
-          <w:rFonts w:eastAsiaTheme="minorHAnsi"/>
-          <w:lang w:eastAsia="en-US"/>
-        </w:rPr>
-        <w:t>. https://doi.org/10.1016/j.jcbs.2020.10.008</w:t>
+        <w:t>The Oxford Handbook of Acceptance and Commitment Therapy</w:t>
+      </w:r>
+      <w:r>
+        <w:rPr>
+          <w:rFonts w:eastAsiaTheme="minorHAnsi"/>
+          <w:lang w:eastAsia="en-US"/>
+        </w:rPr>
+        <w:t xml:space="preserve"> (1st ed.). Oxford University Press. https://doi.org/10.1093/oxfordhb/9780197550076.001.0001</w:t>
       </w:r>
     </w:p>
     <w:p>
@@ -11095,7 +11621,8 @@
           <w:rFonts w:eastAsiaTheme="minorHAnsi"/>
           <w:lang w:eastAsia="en-US"/>
         </w:rPr>
-        <w:t xml:space="preserve">Hussey, I. (2020). </w:t>
+        <w:lastRenderedPageBreak/>
+        <w:t xml:space="preserve">Hayes, S. C., Barnes-Holmes, D., &amp; Roche, B. (2001). </w:t>
       </w:r>
       <w:r>
         <w:rPr>
@@ -11104,7 +11631,30 @@
           <w:iCs/>
           <w:lang w:eastAsia="en-US"/>
         </w:rPr>
-        <w:t xml:space="preserve">General claims require generalized effects: A reply to Ruiz et al.’s (2020) ‘A systematic and critical response to Pendrous et </w:t>
+        <w:t>Relational frame theory: A post-Skinnerian account of human language and cognition</w:t>
+      </w:r>
+      <w:r>
+        <w:rPr>
+          <w:rFonts w:eastAsiaTheme="minorHAnsi"/>
+          <w:lang w:eastAsia="en-US"/>
+        </w:rPr>
+        <w:t>. Kluwer Academic/Plenum Press.</w:t>
+      </w:r>
+    </w:p>
+    <w:p>
+      <w:pPr>
+        <w:pStyle w:val="Bibliography"/>
+        <w:rPr>
+          <w:rFonts w:eastAsiaTheme="minorHAnsi"/>
+          <w:lang w:eastAsia="en-US"/>
+        </w:rPr>
+      </w:pPr>
+      <w:r>
+        <w:rPr>
+          <w:rFonts w:eastAsiaTheme="minorHAnsi"/>
+          <w:lang w:eastAsia="en-US"/>
+        </w:rPr>
+        <w:t xml:space="preserve">Hayes, S. C., Strosahl, K., &amp; Wilson, K. G. (1999). </w:t>
       </w:r>
       <w:r>
         <w:rPr>
@@ -11113,15 +11663,14 @@
           <w:iCs/>
           <w:lang w:eastAsia="en-US"/>
         </w:rPr>
-        <w:lastRenderedPageBreak/>
-        <w:t>al. (2020) replication study.’</w:t>
-      </w:r>
-      <w:r>
-        <w:rPr>
-          <w:rFonts w:eastAsiaTheme="minorHAnsi"/>
-          <w:lang w:eastAsia="en-US"/>
-        </w:rPr>
-        <w:t xml:space="preserve"> PsyArXiv. https://doi.org/10.31234/osf.io/83z2y</w:t>
+        <w:t>Acceptance and Commitment Therapy: An experiential approach to behavior change</w:t>
+      </w:r>
+      <w:r>
+        <w:rPr>
+          <w:rFonts w:eastAsiaTheme="minorHAnsi"/>
+          <w:lang w:eastAsia="en-US"/>
+        </w:rPr>
+        <w:t>. Guilford Press.</w:t>
       </w:r>
     </w:p>
     <w:p>
@@ -11137,7 +11686,7 @@
           <w:rFonts w:eastAsiaTheme="minorHAnsi"/>
           <w:lang w:eastAsia="en-US"/>
         </w:rPr>
-        <w:t xml:space="preserve">Hussey, I., &amp; Cummins, J. (2025, August 11). Post-publication peer-review should focus on highly influential articles. </w:t>
+        <w:t xml:space="preserve">Hulbert-Williams, L., Pendrous, R., Hochard, K. D., &amp; Hulbert-Williams, N. J. (2020). In search of scope: A response to Ruiz et al. (2020). </w:t>
       </w:r>
       <w:r>
         <w:rPr>
@@ -11146,14 +11695,14 @@
           <w:iCs/>
           <w:lang w:eastAsia="en-US"/>
         </w:rPr>
-        <w:t>Mmmdata.Io</w:t>
-      </w:r>
-      <w:r>
-        <w:rPr>
-          <w:rFonts w:eastAsiaTheme="minorHAnsi"/>
-          <w:lang w:eastAsia="en-US"/>
-        </w:rPr>
-        <w:t>. https://mmmdata.io/posts/2025/08/post-publication-peer-review-should-focus-on-highly-influential-articles/</w:t>
+        <w:t>Journal of Contextual Behavioral Science</w:t>
+      </w:r>
+      <w:r>
+        <w:rPr>
+          <w:rFonts w:eastAsiaTheme="minorHAnsi"/>
+          <w:lang w:eastAsia="en-US"/>
+        </w:rPr>
+        <w:t>. https://doi.org/10.1016/j.jcbs.2020.10.008</w:t>
       </w:r>
     </w:p>
     <w:p>
@@ -11169,7 +11718,7 @@
           <w:rFonts w:eastAsiaTheme="minorHAnsi"/>
           <w:lang w:eastAsia="en-US"/>
         </w:rPr>
-        <w:t xml:space="preserve">Kelly, A. D., &amp; Kelly, M. E. (2021). Acceptance and Commitment Training in Applied Behavior Analysis: Where Have You Been All My Life? </w:t>
+        <w:t xml:space="preserve">Hussey, I. (2020). </w:t>
       </w:r>
       <w:r>
         <w:rPr>
@@ -11178,14 +11727,30 @@
           <w:iCs/>
           <w:lang w:eastAsia="en-US"/>
         </w:rPr>
-        <w:t>Behavior Analysis in Practice</w:t>
-      </w:r>
-      <w:r>
-        <w:rPr>
-          <w:rFonts w:eastAsiaTheme="minorHAnsi"/>
-          <w:lang w:eastAsia="en-US"/>
-        </w:rPr>
-        <w:t xml:space="preserve">, </w:t>
+        <w:t>General claims require generalized effects: A reply to Ruiz et al.’s (2020) ‘A systematic and critical response to Pendrous et al. (2020) replication study.’</w:t>
+      </w:r>
+      <w:r>
+        <w:rPr>
+          <w:rFonts w:eastAsiaTheme="minorHAnsi"/>
+          <w:lang w:eastAsia="en-US"/>
+        </w:rPr>
+        <w:t xml:space="preserve"> PsyArXiv. https://doi.org/10.31234/osf.io/83z2y</w:t>
+      </w:r>
+    </w:p>
+    <w:p>
+      <w:pPr>
+        <w:pStyle w:val="Bibliography"/>
+        <w:rPr>
+          <w:rFonts w:eastAsiaTheme="minorHAnsi"/>
+          <w:lang w:eastAsia="en-US"/>
+        </w:rPr>
+      </w:pPr>
+      <w:r>
+        <w:rPr>
+          <w:rFonts w:eastAsiaTheme="minorHAnsi"/>
+          <w:lang w:eastAsia="en-US"/>
+        </w:rPr>
+        <w:t xml:space="preserve">Hussey, I., &amp; Cummins, J. (2025, August 11). Post-publication peer-review should focus on highly influential articles. </w:t>
       </w:r>
       <w:r>
         <w:rPr>
@@ -11194,14 +11759,14 @@
           <w:iCs/>
           <w:lang w:eastAsia="en-US"/>
         </w:rPr>
-        <w:t>15</w:t>
-      </w:r>
-      <w:r>
-        <w:rPr>
-          <w:rFonts w:eastAsiaTheme="minorHAnsi"/>
-          <w:lang w:eastAsia="en-US"/>
-        </w:rPr>
-        <w:t>(1), Article 1. https://doi.org/10.1007/s40617-021-00587-3</w:t>
+        <w:t>Mmmdata.Io</w:t>
+      </w:r>
+      <w:r>
+        <w:rPr>
+          <w:rFonts w:eastAsiaTheme="minorHAnsi"/>
+          <w:lang w:eastAsia="en-US"/>
+        </w:rPr>
+        <w:t>. https://mmmdata.io/posts/2025/08/post-publication-peer-review-should-focus-on-highly-influential-articles/</w:t>
       </w:r>
     </w:p>
     <w:p>
@@ -11217,7 +11782,7 @@
           <w:rFonts w:eastAsiaTheme="minorHAnsi"/>
           <w:lang w:eastAsia="en-US"/>
         </w:rPr>
-        <w:t xml:space="preserve">Law, S., &amp; Hayes, S. C. (2021). Murray Sidman: Fostering progress through foundational choices. </w:t>
+        <w:t xml:space="preserve">Kelly, A. D., &amp; Kelly, M. E. (2021). Acceptance and Commitment Training in Applied Behavior Analysis: Where Have You Been All My Life? </w:t>
       </w:r>
       <w:r>
         <w:rPr>
@@ -11226,7 +11791,7 @@
           <w:iCs/>
           <w:lang w:eastAsia="en-US"/>
         </w:rPr>
-        <w:t>Journal of the Experimental Analysis of Behavior</w:t>
+        <w:t>Behavior Analysis in Practice</w:t>
       </w:r>
       <w:r>
         <w:rPr>
@@ -11242,14 +11807,14 @@
           <w:iCs/>
           <w:lang w:eastAsia="en-US"/>
         </w:rPr>
-        <w:t>115</w:t>
-      </w:r>
-      <w:r>
-        <w:rPr>
-          <w:rFonts w:eastAsiaTheme="minorHAnsi"/>
-          <w:lang w:eastAsia="en-US"/>
-        </w:rPr>
-        <w:t>(1), 21–30. https://doi.org/10.1002/jeab.640</w:t>
+        <w:t>15</w:t>
+      </w:r>
+      <w:r>
+        <w:rPr>
+          <w:rFonts w:eastAsiaTheme="minorHAnsi"/>
+          <w:lang w:eastAsia="en-US"/>
+        </w:rPr>
+        <w:t>(1), Article 1. https://doi.org/10.1007/s40617-021-00587-3</w:t>
       </w:r>
     </w:p>
     <w:p>
@@ -11265,7 +11830,7 @@
           <w:rFonts w:eastAsiaTheme="minorHAnsi"/>
           <w:lang w:eastAsia="en-US"/>
         </w:rPr>
-        <w:t xml:space="preserve">Leichsenring, F., Abbass, A., Hilsenroth, M. J., Leweke, F., Luyten, P., Keefe, J. R., Midgley, N., Rabung, S., Salzer, S., &amp; Steinert, C. (2017). Biases in research: Risk factors for non-replicability in psychotherapy and pharmacotherapy research. </w:t>
+        <w:t xml:space="preserve">Law, S., &amp; Hayes, S. C. (2021). Murray Sidman: Fostering progress through foundational choices. </w:t>
       </w:r>
       <w:r>
         <w:rPr>
@@ -11274,7 +11839,7 @@
           <w:iCs/>
           <w:lang w:eastAsia="en-US"/>
         </w:rPr>
-        <w:t>Psychological Medicine</w:t>
+        <w:t>Journal of the Experimental Analysis of Behavior</w:t>
       </w:r>
       <w:r>
         <w:rPr>
@@ -11290,14 +11855,14 @@
           <w:iCs/>
           <w:lang w:eastAsia="en-US"/>
         </w:rPr>
-        <w:t>47</w:t>
-      </w:r>
-      <w:r>
-        <w:rPr>
-          <w:rFonts w:eastAsiaTheme="minorHAnsi"/>
-          <w:lang w:eastAsia="en-US"/>
-        </w:rPr>
-        <w:t>(6), 1000–1011. https://doi.org/10.1017/S003329171600324X</w:t>
+        <w:t>115</w:t>
+      </w:r>
+      <w:r>
+        <w:rPr>
+          <w:rFonts w:eastAsiaTheme="minorHAnsi"/>
+          <w:lang w:eastAsia="en-US"/>
+        </w:rPr>
+        <w:t>(1), 21–30. https://doi.org/10.1002/jeab.640</w:t>
       </w:r>
     </w:p>
     <w:p>
@@ -11313,7 +11878,7 @@
           <w:rFonts w:eastAsiaTheme="minorHAnsi"/>
           <w:lang w:eastAsia="en-US"/>
         </w:rPr>
-        <w:t xml:space="preserve">Luciano, C., Ruiz, F. J., Torres, R. M. V., &amp; Mar, V. S. (2011). A Relational Frame Analysis of Defusion Interactions in Acceptance and Commitment Therapy. A Preliminary and Quasi-Experimental Study with At-Risk Adolescents. </w:t>
+        <w:t xml:space="preserve">Leichsenring, F., Abbass, A., Hilsenroth, M. J., Leweke, F., Luyten, P., Keefe, J. R., Midgley, N., Rabung, S., Salzer, S., &amp; Steinert, C. (2017). Biases in research: Risk factors for non-replicability in psychotherapy and pharmacotherapy research. </w:t>
       </w:r>
       <w:r>
         <w:rPr>
@@ -11322,30 +11887,14 @@
           <w:iCs/>
           <w:lang w:eastAsia="en-US"/>
         </w:rPr>
-        <w:t>International Journal of Psychology</w:t>
-      </w:r>
-      <w:r>
-        <w:rPr>
-          <w:rFonts w:eastAsiaTheme="minorHAnsi"/>
-          <w:lang w:eastAsia="en-US"/>
-        </w:rPr>
-        <w:t>.</w:t>
-      </w:r>
-    </w:p>
-    <w:p>
-      <w:pPr>
-        <w:pStyle w:val="Bibliography"/>
-        <w:rPr>
-          <w:rFonts w:eastAsiaTheme="minorHAnsi"/>
-          <w:lang w:eastAsia="en-US"/>
-        </w:rPr>
-      </w:pPr>
-      <w:r>
-        <w:rPr>
-          <w:rFonts w:eastAsiaTheme="minorHAnsi"/>
-          <w:lang w:eastAsia="en-US"/>
-        </w:rPr>
-        <w:t xml:space="preserve">Luciano, C., Törneke, N., &amp; Ruiz, F. J. (2023). Clinical Behavior Analysis and RFT: Conceptualizing Psychopathology and Its Treatment. In M. P. Twohig, M. E. Levin, &amp; J. M. Petersen (Eds.), </w:t>
+        <w:t>Psychological Medicine</w:t>
+      </w:r>
+      <w:r>
+        <w:rPr>
+          <w:rFonts w:eastAsiaTheme="minorHAnsi"/>
+          <w:lang w:eastAsia="en-US"/>
+        </w:rPr>
+        <w:t xml:space="preserve">, </w:t>
       </w:r>
       <w:r>
         <w:rPr>
@@ -11354,14 +11903,14 @@
           <w:iCs/>
           <w:lang w:eastAsia="en-US"/>
         </w:rPr>
-        <w:t>The Oxford Handbook of Acceptance and Commitment Therapy</w:t>
-      </w:r>
-      <w:r>
-        <w:rPr>
-          <w:rFonts w:eastAsiaTheme="minorHAnsi"/>
-          <w:lang w:eastAsia="en-US"/>
-        </w:rPr>
-        <w:t xml:space="preserve"> (1st ed., pp. 109–142). Oxford University Press. https://doi.org/10.1093/oxfordhb/9780197550076.013.5</w:t>
+        <w:t>47</w:t>
+      </w:r>
+      <w:r>
+        <w:rPr>
+          <w:rFonts w:eastAsiaTheme="minorHAnsi"/>
+          <w:lang w:eastAsia="en-US"/>
+        </w:rPr>
+        <w:t>(6), 1000–1011. https://doi.org/10.1017/S003329171600324X</w:t>
       </w:r>
     </w:p>
     <w:p>
@@ -11377,7 +11926,7 @@
           <w:rFonts w:eastAsiaTheme="minorHAnsi"/>
           <w:lang w:eastAsia="en-US"/>
         </w:rPr>
-        <w:t xml:space="preserve">Marin, F., Rohatgi, A., &amp; Charlot, S. (2017). </w:t>
+        <w:t xml:space="preserve">Luciano, C., Ruiz, F. J., Torres, R. M. V., &amp; Mar, V. S. (2011). A Relational Frame Analysis of Defusion Interactions in Acceptance and Commitment Therapy. A Preliminary and Quasi-Experimental Study with At-Risk Adolescents. </w:t>
       </w:r>
       <w:r>
         <w:rPr>
@@ -11386,14 +11935,14 @@
           <w:iCs/>
           <w:lang w:eastAsia="en-US"/>
         </w:rPr>
-        <w:t>WebPlotDigitizer, a polyvalent and free software to extract spectra from old astronomical publications: Application to ultraviolet spectropolarimetry</w:t>
-      </w:r>
-      <w:r>
-        <w:rPr>
-          <w:rFonts w:eastAsiaTheme="minorHAnsi"/>
-          <w:lang w:eastAsia="en-US"/>
-        </w:rPr>
-        <w:t xml:space="preserve"> (No. arXiv:1708.02025). arXiv. http://arxiv.org/abs/1708.02025</w:t>
+        <w:t>International Journal of Psychology</w:t>
+      </w:r>
+      <w:r>
+        <w:rPr>
+          <w:rFonts w:eastAsiaTheme="minorHAnsi"/>
+          <w:lang w:eastAsia="en-US"/>
+        </w:rPr>
+        <w:t>.</w:t>
       </w:r>
     </w:p>
     <w:p>
@@ -11409,7 +11958,7 @@
           <w:rFonts w:eastAsiaTheme="minorHAnsi"/>
           <w:lang w:eastAsia="en-US"/>
         </w:rPr>
-        <w:t xml:space="preserve">McLoughlin, S., &amp; Roche, B. T. (2022). ACT: A Process-Based Therapy in search of a process. </w:t>
+        <w:t xml:space="preserve">Luciano, C., Törneke, N., &amp; Ruiz, F. J. (2023). Clinical Behavior Analysis and RFT: Conceptualizing Psychopathology and Its Treatment. In M. P. Twohig, M. E. Levin, &amp; J. M. Petersen (Eds.), </w:t>
       </w:r>
       <w:r>
         <w:rPr>
@@ -11418,14 +11967,14 @@
           <w:iCs/>
           <w:lang w:eastAsia="en-US"/>
         </w:rPr>
-        <w:t>Behavior Therapy</w:t>
-      </w:r>
-      <w:r>
-        <w:rPr>
-          <w:rFonts w:eastAsiaTheme="minorHAnsi"/>
-          <w:lang w:eastAsia="en-US"/>
-        </w:rPr>
-        <w:t>, S0005789422001022. https://doi.org/10.1016/j.beth.2022.07.010</w:t>
+        <w:t>The Oxford Handbook of Acceptance and Commitment Therapy</w:t>
+      </w:r>
+      <w:r>
+        <w:rPr>
+          <w:rFonts w:eastAsiaTheme="minorHAnsi"/>
+          <w:lang w:eastAsia="en-US"/>
+        </w:rPr>
+        <w:t xml:space="preserve"> (1st ed., pp. 109–142). Oxford University Press. https://doi.org/10.1093/oxfordhb/9780197550076.013.5</w:t>
       </w:r>
     </w:p>
     <w:p>
@@ -11441,7 +11990,7 @@
           <w:rFonts w:eastAsiaTheme="minorHAnsi"/>
           <w:lang w:eastAsia="en-US"/>
         </w:rPr>
-        <w:t xml:space="preserve">Morris, S. B. (2008). Estimating Effect Sizes From Pretest-Posttest-Control Group Designs. </w:t>
+        <w:t xml:space="preserve">Marin, F., Rohatgi, A., &amp; Charlot, S. (2017). </w:t>
       </w:r>
       <w:r>
         <w:rPr>
@@ -11450,14 +11999,7 @@
           <w:iCs/>
           <w:lang w:eastAsia="en-US"/>
         </w:rPr>
-        <w:t>Organizational Research Methods</w:t>
-      </w:r>
-      <w:r>
-        <w:rPr>
-          <w:rFonts w:eastAsiaTheme="minorHAnsi"/>
-          <w:lang w:eastAsia="en-US"/>
-        </w:rPr>
-        <w:t xml:space="preserve">, </w:t>
+        <w:t xml:space="preserve">WebPlotDigitizer, a polyvalent and free software to extract spectra from old astronomical </w:t>
       </w:r>
       <w:r>
         <w:rPr>
@@ -11466,14 +12008,14 @@
           <w:iCs/>
           <w:lang w:eastAsia="en-US"/>
         </w:rPr>
-        <w:t>11</w:t>
-      </w:r>
-      <w:r>
-        <w:rPr>
-          <w:rFonts w:eastAsiaTheme="minorHAnsi"/>
-          <w:lang w:eastAsia="en-US"/>
-        </w:rPr>
-        <w:t>(2), 364–386. https://doi.org/10.1177/1094428106291059</w:t>
+        <w:t>publications: Application to ultraviolet spectropolarimetry</w:t>
+      </w:r>
+      <w:r>
+        <w:rPr>
+          <w:rFonts w:eastAsiaTheme="minorHAnsi"/>
+          <w:lang w:eastAsia="en-US"/>
+        </w:rPr>
+        <w:t xml:space="preserve"> (No. arXiv:1708.02025). arXiv. http://arxiv.org/abs/1708.02025</w:t>
       </w:r>
     </w:p>
     <w:p>
@@ -11489,7 +12031,7 @@
           <w:rFonts w:eastAsiaTheme="minorHAnsi"/>
           <w:lang w:eastAsia="en-US"/>
         </w:rPr>
-        <w:t xml:space="preserve">O’Donohue, W., &amp; Masuda, A. (Eds.). (2022). </w:t>
+        <w:t xml:space="preserve">McLoughlin, S., &amp; Roche, B. T. (2022). ACT: A Process-Based Therapy in search of a process. </w:t>
       </w:r>
       <w:r>
         <w:rPr>
@@ -11498,14 +12040,14 @@
           <w:iCs/>
           <w:lang w:eastAsia="en-US"/>
         </w:rPr>
-        <w:t>Behavior therapy: First, second, and third waves.</w:t>
-      </w:r>
-      <w:r>
-        <w:rPr>
-          <w:rFonts w:eastAsiaTheme="minorHAnsi"/>
-          <w:lang w:eastAsia="en-US"/>
-        </w:rPr>
-        <w:t xml:space="preserve"> Springer Nature. https://doi.org/10.1007/978-3-031-11677-3</w:t>
+        <w:t>Behavior Therapy</w:t>
+      </w:r>
+      <w:r>
+        <w:rPr>
+          <w:rFonts w:eastAsiaTheme="minorHAnsi"/>
+          <w:lang w:eastAsia="en-US"/>
+        </w:rPr>
+        <w:t>, S0005789422001022. https://doi.org/10.1016/j.beth.2022.07.010</w:t>
       </w:r>
     </w:p>
     <w:p>
@@ -11521,7 +12063,7 @@
           <w:rFonts w:eastAsiaTheme="minorHAnsi"/>
           <w:lang w:eastAsia="en-US"/>
         </w:rPr>
-        <w:t xml:space="preserve">Pendrous, R., Hulbert-Williams, L., Hochard, K. D., &amp; Hulbert-Williams, N. J. (2020). Appetitive augmental functions and common physical properties in a pain-tolerance metaphor: An extended replication. </w:t>
+        <w:t xml:space="preserve">Morris, S. B. (2008). Estimating Effect Sizes From Pretest-Posttest-Control Group Designs. </w:t>
       </w:r>
       <w:r>
         <w:rPr>
@@ -11530,7 +12072,7 @@
           <w:iCs/>
           <w:lang w:eastAsia="en-US"/>
         </w:rPr>
-        <w:t>Journal of Contextual Behavioral Science</w:t>
+        <w:t>Organizational Research Methods</w:t>
       </w:r>
       <w:r>
         <w:rPr>
@@ -11546,14 +12088,14 @@
           <w:iCs/>
           <w:lang w:eastAsia="en-US"/>
         </w:rPr>
-        <w:t>16</w:t>
-      </w:r>
-      <w:r>
-        <w:rPr>
-          <w:rFonts w:eastAsiaTheme="minorHAnsi"/>
-          <w:lang w:eastAsia="en-US"/>
-        </w:rPr>
-        <w:t>, 17–24. https://doi.org/10.1016/j.jcbs.2020.02.003</w:t>
+        <w:t>11</w:t>
+      </w:r>
+      <w:r>
+        <w:rPr>
+          <w:rFonts w:eastAsiaTheme="minorHAnsi"/>
+          <w:lang w:eastAsia="en-US"/>
+        </w:rPr>
+        <w:t>(2), 364–386. https://doi.org/10.1177/1094428106291059</w:t>
       </w:r>
     </w:p>
     <w:p>
@@ -11569,7 +12111,7 @@
           <w:rFonts w:eastAsiaTheme="minorHAnsi"/>
           <w:lang w:eastAsia="en-US"/>
         </w:rPr>
-        <w:t xml:space="preserve">Rachman, S., Shafran, R., Mitchell, D., Trant, J., &amp; Teachman, B. (1996). How to remain neutral: An experimental analysis of neutralization. </w:t>
+        <w:t xml:space="preserve">O’Donohue, W., &amp; Masuda, A. (Eds.). (2022). </w:t>
       </w:r>
       <w:r>
         <w:rPr>
@@ -11578,14 +12120,30 @@
           <w:iCs/>
           <w:lang w:eastAsia="en-US"/>
         </w:rPr>
-        <w:t>Behaviour Research and Therapy</w:t>
-      </w:r>
-      <w:r>
-        <w:rPr>
-          <w:rFonts w:eastAsiaTheme="minorHAnsi"/>
-          <w:lang w:eastAsia="en-US"/>
-        </w:rPr>
-        <w:t xml:space="preserve">, </w:t>
+        <w:t>Behavior therapy: First, second, and third waves.</w:t>
+      </w:r>
+      <w:r>
+        <w:rPr>
+          <w:rFonts w:eastAsiaTheme="minorHAnsi"/>
+          <w:lang w:eastAsia="en-US"/>
+        </w:rPr>
+        <w:t xml:space="preserve"> Springer Nature. https://doi.org/10.1007/978-3-031-11677-3</w:t>
+      </w:r>
+    </w:p>
+    <w:p>
+      <w:pPr>
+        <w:pStyle w:val="Bibliography"/>
+        <w:rPr>
+          <w:rFonts w:eastAsiaTheme="minorHAnsi"/>
+          <w:lang w:eastAsia="en-US"/>
+        </w:rPr>
+      </w:pPr>
+      <w:r>
+        <w:rPr>
+          <w:rFonts w:eastAsiaTheme="minorHAnsi"/>
+          <w:lang w:eastAsia="en-US"/>
+        </w:rPr>
+        <w:t xml:space="preserve">Pendrous, R., Hulbert-Williams, L., Hochard, K. D., &amp; Hulbert-Williams, N. J. (2020). Appetitive augmental functions and common physical properties in a pain-tolerance metaphor: An extended replication. </w:t>
       </w:r>
       <w:r>
         <w:rPr>
@@ -11594,30 +12152,14 @@
           <w:iCs/>
           <w:lang w:eastAsia="en-US"/>
         </w:rPr>
-        <w:t>34</w:t>
-      </w:r>
-      <w:r>
-        <w:rPr>
-          <w:rFonts w:eastAsiaTheme="minorHAnsi"/>
-          <w:lang w:eastAsia="en-US"/>
-        </w:rPr>
-        <w:t>(11–12), 889–898. https://doi.org/10.1016/S0005-7967(96)00051-4</w:t>
-      </w:r>
-    </w:p>
-    <w:p>
-      <w:pPr>
-        <w:pStyle w:val="Bibliography"/>
-        <w:rPr>
-          <w:rFonts w:eastAsiaTheme="minorHAnsi"/>
-          <w:lang w:eastAsia="en-US"/>
-        </w:rPr>
-      </w:pPr>
-      <w:r>
-        <w:rPr>
-          <w:rFonts w:eastAsiaTheme="minorHAnsi"/>
-          <w:lang w:eastAsia="en-US"/>
-        </w:rPr>
-        <w:t xml:space="preserve">Ruiz, F. J., Gil-Luciano, B., &amp; Segura-Vargas, M. A. (2023). Cognitive defusion. In M. P. Twohig, M. E. Levin, &amp; J. M. Petersen (Eds.), </w:t>
+        <w:t>Journal of Contextual Behavioral Science</w:t>
+      </w:r>
+      <w:r>
+        <w:rPr>
+          <w:rFonts w:eastAsiaTheme="minorHAnsi"/>
+          <w:lang w:eastAsia="en-US"/>
+        </w:rPr>
+        <w:t xml:space="preserve">, </w:t>
       </w:r>
       <w:r>
         <w:rPr>
@@ -11626,14 +12168,14 @@
           <w:iCs/>
           <w:lang w:eastAsia="en-US"/>
         </w:rPr>
-        <w:t>The Oxford Handbook of Acceptance and Commitment Therapy</w:t>
-      </w:r>
-      <w:r>
-        <w:rPr>
-          <w:rFonts w:eastAsiaTheme="minorHAnsi"/>
-          <w:lang w:eastAsia="en-US"/>
-        </w:rPr>
-        <w:t>. Oxford University Press. https://doi.org/10.1093/oxfordhb/9780197550076.001.0001</w:t>
+        <w:t>16</w:t>
+      </w:r>
+      <w:r>
+        <w:rPr>
+          <w:rFonts w:eastAsiaTheme="minorHAnsi"/>
+          <w:lang w:eastAsia="en-US"/>
+        </w:rPr>
+        <w:t>, 17–24. https://doi.org/10.1016/j.jcbs.2020.02.003</w:t>
       </w:r>
     </w:p>
     <w:p>
@@ -11649,7 +12191,7 @@
           <w:rFonts w:eastAsiaTheme="minorHAnsi"/>
           <w:lang w:eastAsia="en-US"/>
         </w:rPr>
-        <w:t xml:space="preserve">Ruiz, F. J., Luciano, C., &amp; Sierra, M. A. (2020). A systematic and critical response to Pendrous et al. (2020) replication study. </w:t>
+        <w:t xml:space="preserve">Rachman, S., Shafran, R., Mitchell, D., Trant, J., &amp; Teachman, B. (1996). How to remain neutral: An experimental analysis of neutralization. </w:t>
       </w:r>
       <w:r>
         <w:rPr>
@@ -11658,30 +12200,14 @@
           <w:iCs/>
           <w:lang w:eastAsia="en-US"/>
         </w:rPr>
-        <w:t>Journal of Contextual Behavioral Science</w:t>
-      </w:r>
-      <w:r>
-        <w:rPr>
-          <w:rFonts w:eastAsiaTheme="minorHAnsi"/>
-          <w:lang w:eastAsia="en-US"/>
-        </w:rPr>
-        <w:t>. https://doi.org/10.1016/j.jcbs.2020.04.011</w:t>
-      </w:r>
-    </w:p>
-    <w:p>
-      <w:pPr>
-        <w:pStyle w:val="Bibliography"/>
-        <w:rPr>
-          <w:rFonts w:eastAsiaTheme="minorHAnsi"/>
-          <w:lang w:eastAsia="en-US"/>
-        </w:rPr>
-      </w:pPr>
-      <w:r>
-        <w:rPr>
-          <w:rFonts w:eastAsiaTheme="minorHAnsi"/>
-          <w:lang w:eastAsia="en-US"/>
-        </w:rPr>
-        <w:t xml:space="preserve">Sierra, M. A., Ruiz, F. J., Flórez, C. L., Hernández, D. R., &amp; Luciano, C. (2016). The Role of Common Physical Properties and Augmental Functions in Metaphor Effect. </w:t>
+        <w:t>Behaviour Research and Therapy</w:t>
+      </w:r>
+      <w:r>
+        <w:rPr>
+          <w:rFonts w:eastAsiaTheme="minorHAnsi"/>
+          <w:lang w:eastAsia="en-US"/>
+        </w:rPr>
+        <w:t xml:space="preserve">, </w:t>
       </w:r>
       <w:r>
         <w:rPr>
@@ -11690,14 +12216,14 @@
           <w:iCs/>
           <w:lang w:eastAsia="en-US"/>
         </w:rPr>
-        <w:t>International Journal of Psychology</w:t>
-      </w:r>
-      <w:r>
-        <w:rPr>
-          <w:rFonts w:eastAsiaTheme="minorHAnsi"/>
-          <w:lang w:eastAsia="en-US"/>
-        </w:rPr>
-        <w:t>, 15.</w:t>
+        <w:t>34</w:t>
+      </w:r>
+      <w:r>
+        <w:rPr>
+          <w:rFonts w:eastAsiaTheme="minorHAnsi"/>
+          <w:lang w:eastAsia="en-US"/>
+        </w:rPr>
+        <w:t>(11–12), 889–898. https://doi.org/10.1016/S0005-7967(96)00051-4</w:t>
       </w:r>
     </w:p>
     <w:p>
@@ -11713,7 +12239,7 @@
           <w:rFonts w:eastAsiaTheme="minorHAnsi"/>
           <w:lang w:eastAsia="en-US"/>
         </w:rPr>
-        <w:t xml:space="preserve">Simonsohn, U., Simmons, J. P., &amp; Nelson, L. D. (2015). </w:t>
+        <w:t xml:space="preserve">Ruiz, F. J., Gil-Luciano, B., &amp; Segura-Vargas, M. A. (2023). Cognitive defusion. In M. P. Twohig, M. E. Levin, &amp; J. M. Petersen (Eds.), </w:t>
       </w:r>
       <w:r>
         <w:rPr>
@@ -11722,14 +12248,14 @@
           <w:iCs/>
           <w:lang w:eastAsia="en-US"/>
         </w:rPr>
-        <w:t>Specification Curve: Descriptive and Inferential Statistics on All Reasonable Specifications</w:t>
-      </w:r>
-      <w:r>
-        <w:rPr>
-          <w:rFonts w:eastAsiaTheme="minorHAnsi"/>
-          <w:lang w:eastAsia="en-US"/>
-        </w:rPr>
-        <w:t>. https://papers.ssrn.com/sol3/papers.cfm?abstract_id=2694998</w:t>
+        <w:t>The Oxford Handbook of Acceptance and Commitment Therapy</w:t>
+      </w:r>
+      <w:r>
+        <w:rPr>
+          <w:rFonts w:eastAsiaTheme="minorHAnsi"/>
+          <w:lang w:eastAsia="en-US"/>
+        </w:rPr>
+        <w:t>. Oxford University Press. https://doi.org/10.1093/oxfordhb/9780197550076.001.0001</w:t>
       </w:r>
     </w:p>
     <w:p>
@@ -11745,7 +12271,7 @@
           <w:rFonts w:eastAsiaTheme="minorHAnsi"/>
           <w:lang w:eastAsia="en-US"/>
         </w:rPr>
-        <w:t xml:space="preserve">Spellman, B. A. (2015). A short (personal) future history of revolution 2.0. </w:t>
+        <w:t xml:space="preserve">Ruiz, F. J., Luciano, C., &amp; Sierra, M. A. (2020). A systematic and critical response to Pendrous et al. (2020) replication study. </w:t>
       </w:r>
       <w:r>
         <w:rPr>
@@ -11754,14 +12280,30 @@
           <w:iCs/>
           <w:lang w:eastAsia="en-US"/>
         </w:rPr>
-        <w:t>Perspectives on Psychological Science</w:t>
-      </w:r>
-      <w:r>
-        <w:rPr>
-          <w:rFonts w:eastAsiaTheme="minorHAnsi"/>
-          <w:lang w:eastAsia="en-US"/>
-        </w:rPr>
-        <w:t xml:space="preserve">, </w:t>
+        <w:t>Journal of Contextual Behavioral Science</w:t>
+      </w:r>
+      <w:r>
+        <w:rPr>
+          <w:rFonts w:eastAsiaTheme="minorHAnsi"/>
+          <w:lang w:eastAsia="en-US"/>
+        </w:rPr>
+        <w:t>. https://doi.org/10.1016/j.jcbs.2020.04.011</w:t>
+      </w:r>
+    </w:p>
+    <w:p>
+      <w:pPr>
+        <w:pStyle w:val="Bibliography"/>
+        <w:rPr>
+          <w:rFonts w:eastAsiaTheme="minorHAnsi"/>
+          <w:lang w:eastAsia="en-US"/>
+        </w:rPr>
+      </w:pPr>
+      <w:r>
+        <w:rPr>
+          <w:rFonts w:eastAsiaTheme="minorHAnsi"/>
+          <w:lang w:eastAsia="en-US"/>
+        </w:rPr>
+        <w:t xml:space="preserve">Sierra, M. A., Ruiz, F. J., Flórez, C. L., Hernández, D. R., &amp; Luciano, C. (2016). The Role of Common Physical Properties and Augmental Functions in Metaphor Effect. </w:t>
       </w:r>
       <w:r>
         <w:rPr>
@@ -11770,14 +12312,14 @@
           <w:iCs/>
           <w:lang w:eastAsia="en-US"/>
         </w:rPr>
-        <w:t>10</w:t>
-      </w:r>
-      <w:r>
-        <w:rPr>
-          <w:rFonts w:eastAsiaTheme="minorHAnsi"/>
-          <w:lang w:eastAsia="en-US"/>
-        </w:rPr>
-        <w:t>(6), 886–899. https://doi.org/10.1177/1745691615609918</w:t>
+        <w:t>International Journal of Psychology</w:t>
+      </w:r>
+      <w:r>
+        <w:rPr>
+          <w:rFonts w:eastAsiaTheme="minorHAnsi"/>
+          <w:lang w:eastAsia="en-US"/>
+        </w:rPr>
+        <w:t>, 15.</w:t>
       </w:r>
     </w:p>
     <w:p>
@@ -11793,7 +12335,7 @@
           <w:rFonts w:eastAsiaTheme="minorHAnsi"/>
           <w:lang w:eastAsia="en-US"/>
         </w:rPr>
-        <w:t xml:space="preserve">Steegen, S., Tuerlinckx, F., Gelman, A., &amp; Vanpaemel, W. (2016). Increasing transparency through a multiverse analysis. </w:t>
+        <w:t xml:space="preserve">Simonsohn, U., Simmons, J. P., &amp; Nelson, L. D. (2015). </w:t>
       </w:r>
       <w:r>
         <w:rPr>
@@ -11802,14 +12344,30 @@
           <w:iCs/>
           <w:lang w:eastAsia="en-US"/>
         </w:rPr>
-        <w:t>Perspectives on Psychological Science</w:t>
-      </w:r>
-      <w:r>
-        <w:rPr>
-          <w:rFonts w:eastAsiaTheme="minorHAnsi"/>
-          <w:lang w:eastAsia="en-US"/>
-        </w:rPr>
-        <w:t xml:space="preserve">, </w:t>
+        <w:t>Specification Curve: Descriptive and Inferential Statistics on All Reasonable Specifications</w:t>
+      </w:r>
+      <w:r>
+        <w:rPr>
+          <w:rFonts w:eastAsiaTheme="minorHAnsi"/>
+          <w:lang w:eastAsia="en-US"/>
+        </w:rPr>
+        <w:t>. https://papers.ssrn.com/sol3/papers.cfm?abstract_id=2694998</w:t>
+      </w:r>
+    </w:p>
+    <w:p>
+      <w:pPr>
+        <w:pStyle w:val="Bibliography"/>
+        <w:rPr>
+          <w:rFonts w:eastAsiaTheme="minorHAnsi"/>
+          <w:lang w:eastAsia="en-US"/>
+        </w:rPr>
+      </w:pPr>
+      <w:r>
+        <w:rPr>
+          <w:rFonts w:eastAsiaTheme="minorHAnsi"/>
+          <w:lang w:eastAsia="en-US"/>
+        </w:rPr>
+        <w:t xml:space="preserve">Spellman, B. A. (2015). A short (personal) future history of revolution 2.0. </w:t>
       </w:r>
       <w:r>
         <w:rPr>
@@ -11818,30 +12376,14 @@
           <w:iCs/>
           <w:lang w:eastAsia="en-US"/>
         </w:rPr>
-        <w:t>11</w:t>
-      </w:r>
-      <w:r>
-        <w:rPr>
-          <w:rFonts w:eastAsiaTheme="minorHAnsi"/>
-          <w:lang w:eastAsia="en-US"/>
-        </w:rPr>
-        <w:t>(5), 702–712.</w:t>
-      </w:r>
-    </w:p>
-    <w:p>
-      <w:pPr>
-        <w:pStyle w:val="Bibliography"/>
-        <w:rPr>
-          <w:rFonts w:eastAsiaTheme="minorHAnsi"/>
-          <w:lang w:eastAsia="en-US"/>
-        </w:rPr>
-      </w:pPr>
-      <w:r>
-        <w:rPr>
-          <w:rFonts w:eastAsiaTheme="minorHAnsi"/>
-          <w:lang w:eastAsia="en-US"/>
-        </w:rPr>
-        <w:t xml:space="preserve">Tackett, J. L., Brandes, C. M., King, K. M., &amp; Markon, K. E. (2019). Psychology’s Replication Crisis and Clinical Psychological Science. </w:t>
+        <w:t>Perspectives on Psychological Science</w:t>
+      </w:r>
+      <w:r>
+        <w:rPr>
+          <w:rFonts w:eastAsiaTheme="minorHAnsi"/>
+          <w:lang w:eastAsia="en-US"/>
+        </w:rPr>
+        <w:t xml:space="preserve">, </w:t>
       </w:r>
       <w:r>
         <w:rPr>
@@ -11850,14 +12392,30 @@
           <w:iCs/>
           <w:lang w:eastAsia="en-US"/>
         </w:rPr>
-        <w:t>Annual Review of Clinical Psychology</w:t>
-      </w:r>
-      <w:r>
-        <w:rPr>
-          <w:rFonts w:eastAsiaTheme="minorHAnsi"/>
-          <w:lang w:eastAsia="en-US"/>
-        </w:rPr>
-        <w:t xml:space="preserve">, </w:t>
+        <w:t>10</w:t>
+      </w:r>
+      <w:r>
+        <w:rPr>
+          <w:rFonts w:eastAsiaTheme="minorHAnsi"/>
+          <w:lang w:eastAsia="en-US"/>
+        </w:rPr>
+        <w:t>(6), 886–899. https://doi.org/10.1177/1745691615609918</w:t>
+      </w:r>
+    </w:p>
+    <w:p>
+      <w:pPr>
+        <w:pStyle w:val="Bibliography"/>
+        <w:rPr>
+          <w:rFonts w:eastAsiaTheme="minorHAnsi"/>
+          <w:lang w:eastAsia="en-US"/>
+        </w:rPr>
+      </w:pPr>
+      <w:r>
+        <w:rPr>
+          <w:rFonts w:eastAsiaTheme="minorHAnsi"/>
+          <w:lang w:eastAsia="en-US"/>
+        </w:rPr>
+        <w:t xml:space="preserve">Steegen, S., Tuerlinckx, F., Gelman, A., &amp; Vanpaemel, W. (2016). Increasing transparency through a multiverse analysis. </w:t>
       </w:r>
       <w:r>
         <w:rPr>
@@ -11866,30 +12424,14 @@
           <w:iCs/>
           <w:lang w:eastAsia="en-US"/>
         </w:rPr>
-        <w:t>15</w:t>
-      </w:r>
-      <w:r>
-        <w:rPr>
-          <w:rFonts w:eastAsiaTheme="minorHAnsi"/>
-          <w:lang w:eastAsia="en-US"/>
-        </w:rPr>
-        <w:t>(1), 579–604. https://doi.org/10.1146/annurev-clinpsy-050718-095710</w:t>
-      </w:r>
-    </w:p>
-    <w:p>
-      <w:pPr>
-        <w:pStyle w:val="Bibliography"/>
-        <w:rPr>
-          <w:rFonts w:eastAsiaTheme="minorHAnsi"/>
-          <w:lang w:eastAsia="en-US"/>
-        </w:rPr>
-      </w:pPr>
-      <w:r>
-        <w:rPr>
-          <w:rFonts w:eastAsiaTheme="minorHAnsi"/>
-          <w:lang w:eastAsia="en-US"/>
-        </w:rPr>
-        <w:t xml:space="preserve">Task Force on the Strategies and Tactics of Contextual Behavioral Science Research. (2021). </w:t>
+        <w:t>Perspectives on Psychological Science</w:t>
+      </w:r>
+      <w:r>
+        <w:rPr>
+          <w:rFonts w:eastAsiaTheme="minorHAnsi"/>
+          <w:lang w:eastAsia="en-US"/>
+        </w:rPr>
+        <w:t xml:space="preserve">, </w:t>
       </w:r>
       <w:r>
         <w:rPr>
@@ -11898,14 +12440,14 @@
           <w:iCs/>
           <w:lang w:eastAsia="en-US"/>
         </w:rPr>
-        <w:t>Adoption of Open Science Recommendations | Association for Contextual Behavioral Science</w:t>
-      </w:r>
-      <w:r>
-        <w:rPr>
-          <w:rFonts w:eastAsiaTheme="minorHAnsi"/>
-          <w:lang w:eastAsia="en-US"/>
-        </w:rPr>
-        <w:t>. https://contextualscience.org/news/adoption_of_open_science_recommendations</w:t>
+        <w:t>11</w:t>
+      </w:r>
+      <w:r>
+        <w:rPr>
+          <w:rFonts w:eastAsiaTheme="minorHAnsi"/>
+          <w:lang w:eastAsia="en-US"/>
+        </w:rPr>
+        <w:t>(5), 702–712.</w:t>
       </w:r>
     </w:p>
     <w:p>
@@ -11921,7 +12463,8 @@
           <w:rFonts w:eastAsiaTheme="minorHAnsi"/>
           <w:lang w:eastAsia="en-US"/>
         </w:rPr>
-        <w:t xml:space="preserve">Twohig, M. P., Levin, M. E., &amp; Petersen, J. M. (Eds.). (2023). </w:t>
+        <w:lastRenderedPageBreak/>
+        <w:t xml:space="preserve">Tackett, J. L., Brandes, C. M., King, K. M., &amp; Markon, K. E. (2019). Psychology’s Replication Crisis and Clinical Psychological Science. </w:t>
       </w:r>
       <w:r>
         <w:rPr>
@@ -11930,38 +12473,14 @@
           <w:iCs/>
           <w:lang w:eastAsia="en-US"/>
         </w:rPr>
-        <w:t>The Oxford Handbook of Acceptance and Commitment Therapy</w:t>
-      </w:r>
-      <w:r>
-        <w:rPr>
-          <w:rFonts w:eastAsiaTheme="minorHAnsi"/>
-          <w:lang w:eastAsia="en-US"/>
-        </w:rPr>
-        <w:t xml:space="preserve"> (1st ed.). Oxford University Press. </w:t>
-      </w:r>
-      <w:r>
-        <w:rPr>
-          <w:rFonts w:eastAsiaTheme="minorHAnsi"/>
-          <w:lang w:eastAsia="en-US"/>
-        </w:rPr>
-        <w:lastRenderedPageBreak/>
-        <w:t>https://doi.org/10.1093/oxfordhb/9780197550076.001.0001</w:t>
-      </w:r>
-    </w:p>
-    <w:p>
-      <w:pPr>
-        <w:pStyle w:val="Bibliography"/>
-        <w:rPr>
-          <w:rFonts w:eastAsiaTheme="minorHAnsi"/>
-          <w:lang w:eastAsia="en-US"/>
-        </w:rPr>
-      </w:pPr>
-      <w:r>
-        <w:rPr>
-          <w:rFonts w:eastAsiaTheme="minorHAnsi"/>
-          <w:lang w:eastAsia="en-US"/>
-        </w:rPr>
-        <w:t xml:space="preserve">van den Hout, M., Kindt, M., Weiland, T., &amp; Peters, M. (2002). Instructed neutralization, spontaneous neutralization and prevented neutralization after an obsession-like thought. </w:t>
+        <w:t>Annual Review of Clinical Psychology</w:t>
+      </w:r>
+      <w:r>
+        <w:rPr>
+          <w:rFonts w:eastAsiaTheme="minorHAnsi"/>
+          <w:lang w:eastAsia="en-US"/>
+        </w:rPr>
+        <w:t xml:space="preserve">, </w:t>
       </w:r>
       <w:r>
         <w:rPr>
@@ -11970,14 +12489,30 @@
           <w:iCs/>
           <w:lang w:eastAsia="en-US"/>
         </w:rPr>
-        <w:t>Journal of Behavior Therapy and Experimental Psychiatry</w:t>
-      </w:r>
-      <w:r>
-        <w:rPr>
-          <w:rFonts w:eastAsiaTheme="minorHAnsi"/>
-          <w:lang w:eastAsia="en-US"/>
-        </w:rPr>
-        <w:t xml:space="preserve">, </w:t>
+        <w:t>15</w:t>
+      </w:r>
+      <w:r>
+        <w:rPr>
+          <w:rFonts w:eastAsiaTheme="minorHAnsi"/>
+          <w:lang w:eastAsia="en-US"/>
+        </w:rPr>
+        <w:t>(1), 579–604. https://doi.org/10.1146/annurev-clinpsy-050718-095710</w:t>
+      </w:r>
+    </w:p>
+    <w:p>
+      <w:pPr>
+        <w:pStyle w:val="Bibliography"/>
+        <w:rPr>
+          <w:rFonts w:eastAsiaTheme="minorHAnsi"/>
+          <w:lang w:eastAsia="en-US"/>
+        </w:rPr>
+      </w:pPr>
+      <w:r>
+        <w:rPr>
+          <w:rFonts w:eastAsiaTheme="minorHAnsi"/>
+          <w:lang w:eastAsia="en-US"/>
+        </w:rPr>
+        <w:t xml:space="preserve">Task Force on the Strategies and Tactics of Contextual Behavioral Science Research. (2021). </w:t>
       </w:r>
       <w:r>
         <w:rPr>
@@ -11986,6 +12521,93 @@
           <w:iCs/>
           <w:lang w:eastAsia="en-US"/>
         </w:rPr>
+        <w:t>Adoption of Open Science Recommendations | Association for Contextual Behavioral Science</w:t>
+      </w:r>
+      <w:r>
+        <w:rPr>
+          <w:rFonts w:eastAsiaTheme="minorHAnsi"/>
+          <w:lang w:eastAsia="en-US"/>
+        </w:rPr>
+        <w:t>. https://contextualscience.org/news/adoption_of_open_science_recommendations</w:t>
+      </w:r>
+    </w:p>
+    <w:p>
+      <w:pPr>
+        <w:pStyle w:val="Bibliography"/>
+        <w:rPr>
+          <w:rFonts w:eastAsiaTheme="minorHAnsi"/>
+          <w:lang w:eastAsia="en-US"/>
+        </w:rPr>
+      </w:pPr>
+      <w:r>
+        <w:rPr>
+          <w:rFonts w:eastAsiaTheme="minorHAnsi"/>
+          <w:lang w:eastAsia="en-US"/>
+        </w:rPr>
+        <w:t xml:space="preserve">Twohig, M. P., Levin, M. E., &amp; Petersen, J. M. (Eds.). (2023). </w:t>
+      </w:r>
+      <w:r>
+        <w:rPr>
+          <w:rFonts w:eastAsiaTheme="minorHAnsi"/>
+          <w:i/>
+          <w:iCs/>
+          <w:lang w:eastAsia="en-US"/>
+        </w:rPr>
+        <w:t>The Oxford Handbook of Acceptance and Commitment Therapy</w:t>
+      </w:r>
+      <w:r>
+        <w:rPr>
+          <w:rFonts w:eastAsiaTheme="minorHAnsi"/>
+          <w:lang w:eastAsia="en-US"/>
+        </w:rPr>
+        <w:t xml:space="preserve"> (1st ed.). </w:t>
+      </w:r>
+      <w:r>
+        <w:rPr>
+          <w:rFonts w:eastAsiaTheme="minorHAnsi"/>
+          <w:lang w:eastAsia="en-US"/>
+        </w:rPr>
+        <w:t>Oxford University Press. https://doi.org/10.1093/oxfordhb/9780197550076.001.0001</w:t>
+      </w:r>
+    </w:p>
+    <w:p>
+      <w:pPr>
+        <w:pStyle w:val="Bibliography"/>
+        <w:rPr>
+          <w:rFonts w:eastAsiaTheme="minorHAnsi"/>
+          <w:lang w:eastAsia="en-US"/>
+        </w:rPr>
+      </w:pPr>
+      <w:r>
+        <w:rPr>
+          <w:rFonts w:eastAsiaTheme="minorHAnsi"/>
+          <w:lang w:eastAsia="en-US"/>
+        </w:rPr>
+        <w:t xml:space="preserve">van den Hout, M., Kindt, M., Weiland, T., &amp; Peters, M. (2002). Instructed neutralization, spontaneous neutralization and prevented neutralization after an obsession-like thought. </w:t>
+      </w:r>
+      <w:r>
+        <w:rPr>
+          <w:rFonts w:eastAsiaTheme="minorHAnsi"/>
+          <w:i/>
+          <w:iCs/>
+          <w:lang w:eastAsia="en-US"/>
+        </w:rPr>
+        <w:t>Journal of Behavior Therapy and Experimental Psychiatry</w:t>
+      </w:r>
+      <w:r>
+        <w:rPr>
+          <w:rFonts w:eastAsiaTheme="minorHAnsi"/>
+          <w:lang w:eastAsia="en-US"/>
+        </w:rPr>
+        <w:t xml:space="preserve">, </w:t>
+      </w:r>
+      <w:r>
+        <w:rPr>
+          <w:rFonts w:eastAsiaTheme="minorHAnsi"/>
+          <w:i/>
+          <w:iCs/>
+          <w:lang w:eastAsia="en-US"/>
+        </w:rPr>
         <w:t>33</w:t>
       </w:r>
       <w:r>
@@ -11993,14 +12615,7 @@
           <w:rFonts w:eastAsiaTheme="minorHAnsi"/>
           <w:lang w:eastAsia="en-US"/>
         </w:rPr>
-        <w:t xml:space="preserve">(3–4), </w:t>
-      </w:r>
-      <w:r>
-        <w:rPr>
-          <w:rFonts w:eastAsiaTheme="minorHAnsi"/>
-          <w:lang w:eastAsia="en-US"/>
-        </w:rPr>
-        <w:t>177–189. https://doi.org/10.1016/S0005-7916(02)00048-4</w:t>
+        <w:t>(3–4), 177–189. https://doi.org/10.1016/S0005-7916(02)00048-4</w:t>
       </w:r>
     </w:p>
     <w:p>

</xml_diff>

<commit_message>
updated manuscript and cover letter
</commit_message>
<xml_diff>
--- a/communication/preprint/Hussey - 2026 - a critical reanalysis of Foody et al. 2013.docx
+++ b/communication/preprint/Hussey - 2026 - a critical reanalysis of Foody et al. 2013.docx
@@ -723,7 +723,7 @@
         <w:rPr>
           <w:lang w:val="en-US"/>
         </w:rPr>
-        <w:instrText xml:space="preserve"> ADDIN ZOTERO_ITEM CSL_CITATION {"citationID":"2dGs8WzI","properties":{"formattedCitation":"(Hayes et al., 1999)","plainCitation":"(Hayes et al., 1999)","noteIndex":0},"citationItems":[{"id":1816,"uris":["http://zotero.org/users/1687755/items/RW6HQ5RW"],"itemData":{"id":1816,"type":"book","abstract":"The prevailing view among therapists as well as clients is that a more vital life can be attained by overcoming negative thoughts and feelings. Yet despite efforts to achieve this goal, many individuals continue to suffer with behavior disorders, adjustment difficulties, and low life satisfaction. Acceptance and Commitment Therapy (ACT) is a unique psychotherapeutic approach that addresses this issue by altering the very ground on which rational change strategies rest. Within a coherent theoretical and philosophical framework, ACT illuminates the ways clients understand and perpetuate their difficulties through language. The book shows how interventions based on metaphor, paradox, and experiential exercises can enable clients to break free of language traps and make contact with thoughts, feelings, memories, and physical sensations that have been feared and avoided. Detailed guidelines are presented for helping clients recontextualize and accept these private events, develop greater clarity about personal values, and commit to needed behavior change. Providing in one volume a scientifically sound theory of psychopathology and a practical treatment model, and illustrated by a wealth of clinical examples, this is an important resource for practitioners and students in the full range of behavioral health care fields.","ISBN":"978-1-57230-481-9","language":"en","number-of-pages":"324","publisher":"Guilford Press","source":"Google Books","title":"Acceptance and Commitment Therapy: An experiential approach to behavior change","title-short":"Acceptance and Commitment Therapy","author":[{"family":"Hayes","given":"Steven C."},{"family":"Strosahl","given":"Kirk"},{"family":"Wilson","given":"Kelly G."}],"issued":{"date-parts":[["1999"]]}}}],"schema":"https://github.com/citation-style-language/schema/raw/master/csl-citation.json"} </w:instrText>
+        <w:instrText xml:space="preserve"> ADDIN ZOTERO_ITEM CSL_CITATION {"citationID":"Gl1ZT7ih","properties":{"unsorted":false,"formattedCitation":"(ACT: Hayes et al., 1999)","plainCitation":"(ACT: Hayes et al., 1999)","noteIndex":0},"citationItems":[{"id":1816,"uris":["http://zotero.org/users/1687755/items/RW6HQ5RW"],"itemData":{"id":1816,"type":"book","abstract":"The prevailing view among therapists as well as clients is that a more vital life can be attained by overcoming negative thoughts and feelings. Yet despite efforts to achieve this goal, many individuals continue to suffer with behavior disorders, adjustment difficulties, and low life satisfaction. Acceptance and Commitment Therapy (ACT) is a unique psychotherapeutic approach that addresses this issue by altering the very ground on which rational change strategies rest. Within a coherent theoretical and philosophical framework, ACT illuminates the ways clients understand and perpetuate their difficulties through language. The book shows how interventions based on metaphor, paradox, and experiential exercises can enable clients to break free of language traps and make contact with thoughts, feelings, memories, and physical sensations that have been feared and avoided. Detailed guidelines are presented for helping clients recontextualize and accept these private events, develop greater clarity about personal values, and commit to needed behavior change. Providing in one volume a scientifically sound theory of psychopathology and a practical treatment model, and illustrated by a wealth of clinical examples, this is an important resource for practitioners and students in the full range of behavioral health care fields.","ISBN":"978-1-57230-481-9","language":"en","number-of-pages":"324","publisher":"Guilford Press","source":"Google Books","title":"Acceptance and Commitment Therapy: An experiential approach to behavior change","title-short":"Acceptance and Commitment Therapy","author":[{"family":"Hayes","given":"Steven C."},{"family":"Strosahl","given":"Kirk"},{"family":"Wilson","given":"Kelly G."}],"issued":{"date-parts":[["1999"]]}},"prefix":"ACT: "}],"schema":"https://github.com/citation-style-language/schema/raw/master/csl-citation.json"} </w:instrText>
       </w:r>
       <w:r>
         <w:rPr>
@@ -736,7 +736,7 @@
           <w:noProof/>
           <w:lang w:val="en-US"/>
         </w:rPr>
-        <w:t>(Hayes et al., 1999)</w:t>
+        <w:t>(ACT: Hayes et al., 1999)</w:t>
       </w:r>
       <w:r>
         <w:rPr>
@@ -748,7 +748,7 @@
         <w:rPr>
           <w:lang w:val="en-US"/>
         </w:rPr>
-        <w:t xml:space="preserve">. (ACT). </w:t>
+        <w:t xml:space="preserve">. </w:t>
       </w:r>
       <w:r>
         <w:rPr>
@@ -1326,6 +1326,32 @@
         <w:rPr>
           <w:lang w:val="en-US"/>
         </w:rPr>
+        <w:t>, such as Foody et al. (2013, 2015)</w:t>
+      </w:r>
+      <w:r>
+        <w:rPr>
+          <w:lang w:val="en-US"/>
+        </w:rPr>
+        <w:t xml:space="preserve"> </w:t>
+      </w:r>
+      <w:r>
+        <w:rPr>
+          <w:lang w:val="en-US"/>
+        </w:rPr>
+        <w:t xml:space="preserve">This paper evaluates only whether these two studies support this specific claim; it is not an assessment of the ACT–RFT </w:t>
+      </w:r>
+      <w:proofErr w:type="gramStart"/>
+      <w:r>
+        <w:rPr>
+          <w:lang w:val="en-US"/>
+        </w:rPr>
+        <w:t>literature as a whole</w:t>
+      </w:r>
+      <w:proofErr w:type="gramEnd"/>
+      <w:r>
+        <w:rPr>
+          <w:lang w:val="en-US"/>
+        </w:rPr>
         <w:t>.</w:t>
       </w:r>
     </w:p>
@@ -1823,7 +1849,13 @@
         <w:rPr>
           <w:lang w:val="en-US"/>
         </w:rPr>
-        <w:t xml:space="preserve"> [in Foody et al. (2013)]” (Foody et al., 2015, p. 241), when in fact the results of the RM-ANOVAs </w:t>
+        <w:t xml:space="preserve"> [in Foody et al. (2013)]” (Foody et al., 2015, p. 241), when in fact </w:t>
+      </w:r>
+      <w:r>
+        <w:rPr>
+          <w:lang w:val="en-US"/>
+        </w:rPr>
+        <w:t xml:space="preserve">the results of the RM-ANOVAs </w:t>
       </w:r>
       <w:r>
         <w:rPr>
@@ -2034,14 +2066,21 @@
           <w:rStyle w:val="highlight"/>
           <w:lang w:val="en-US"/>
         </w:rPr>
-        <w:t>mischaracterizes</w:t>
+        <w:t xml:space="preserve">inaccurately </w:t>
       </w:r>
       <w:r>
         <w:rPr>
           <w:rStyle w:val="highlight"/>
           <w:lang w:val="en-US"/>
         </w:rPr>
-        <w:t xml:space="preserve"> the null results found by Foody et al. (2015) as if they support the claim.</w:t>
+        <w:t xml:space="preserve">characterizes </w:t>
+      </w:r>
+      <w:r>
+        <w:rPr>
+          <w:rStyle w:val="highlight"/>
+          <w:lang w:val="en-US"/>
+        </w:rPr>
+        <w:t>the null results found by Foody et al. (2015) as if they support the claim.</w:t>
       </w:r>
     </w:p>
     <w:p>
@@ -2219,24 +2258,6 @@
         </w:rPr>
         <w:t xml:space="preserve">do not cite the failed replication by Foody et al. (2015). </w:t>
       </w:r>
-      <w:r>
-        <w:rPr>
-          <w:lang w:val="en-US"/>
-        </w:rPr>
-        <w:t xml:space="preserve">It is important to </w:t>
-      </w:r>
-      <w:r>
-        <w:rPr>
-          <w:lang w:val="en-US"/>
-        </w:rPr>
-        <w:t>recognize</w:t>
-      </w:r>
-      <w:r>
-        <w:rPr>
-          <w:lang w:val="en-US"/>
-        </w:rPr>
-        <w:t xml:space="preserve"> that there is significant overlap in authorship between these publications, so mere unawareness of the failed replication is implausible.</w:t>
-      </w:r>
     </w:p>
     <w:p>
       <w:pPr>
@@ -2658,7 +2679,14 @@
         <w:rPr>
           <w:lang w:val="en-US"/>
         </w:rPr>
-        <w:t xml:space="preserve">In their article celebrating the contributions of Murray Sidman, Law &amp; Hayes </w:t>
+        <w:t xml:space="preserve">In their article </w:t>
+      </w:r>
+      <w:r>
+        <w:rPr>
+          <w:lang w:val="en-US"/>
+        </w:rPr>
+        <w:lastRenderedPageBreak/>
+        <w:t xml:space="preserve">celebrating the contributions of Murray Sidman, Law &amp; Hayes </w:t>
       </w:r>
       <w:r>
         <w:rPr>
@@ -2702,34 +2730,55 @@
           <w:iCs/>
           <w:lang w:val="en-US"/>
         </w:rPr>
-        <w:t xml:space="preserve">“understanding how to foster </w:t>
-      </w:r>
-      <w:r>
-        <w:rPr>
-          <w:i/>
-          <w:iCs/>
-          <w:lang w:val="en-US"/>
-        </w:rPr>
-        <w:lastRenderedPageBreak/>
-        <w:t>healthy perspective-taking seems central to establishing self-direction, independence, and values-based actions (Foody et al., 2015)”</w:t>
-      </w:r>
-      <w:r>
-        <w:rPr>
-          <w:lang w:val="en-US"/>
-        </w:rPr>
-        <w:t xml:space="preserve">, which not only </w:t>
-      </w:r>
-      <w:r>
-        <w:rPr>
-          <w:lang w:val="en-US"/>
-        </w:rPr>
-        <w:t>mischaracterizes</w:t>
-      </w:r>
-      <w:r>
-        <w:rPr>
-          <w:lang w:val="en-US"/>
-        </w:rPr>
-        <w:t xml:space="preserve"> the nature of this failed replication but also the general nature of the study and its possible conclusions, which were not related to self-direction, independence, or values-based action.</w:t>
+        <w:t>“understanding how to foster healthy perspective-taking seems central to establishing self-direction, independence, and values-based actions (Foody et al., 2015)”</w:t>
+      </w:r>
+      <w:r>
+        <w:rPr>
+          <w:lang w:val="en-US"/>
+        </w:rPr>
+        <w:t xml:space="preserve">, which </w:t>
+      </w:r>
+      <w:r>
+        <w:rPr>
+          <w:lang w:val="en-US"/>
+        </w:rPr>
+        <w:t xml:space="preserve">inaccurately </w:t>
+      </w:r>
+      <w:r>
+        <w:rPr>
+          <w:lang w:val="en-US"/>
+        </w:rPr>
+        <w:t>characterizes</w:t>
+      </w:r>
+      <w:r>
+        <w:rPr>
+          <w:lang w:val="en-US"/>
+        </w:rPr>
+        <w:t xml:space="preserve"> the nature of th</w:t>
+      </w:r>
+      <w:r>
+        <w:rPr>
+          <w:lang w:val="en-US"/>
+        </w:rPr>
+        <w:t xml:space="preserve">e </w:t>
+      </w:r>
+      <w:r>
+        <w:rPr>
+          <w:lang w:val="en-US"/>
+        </w:rPr>
+        <w:t xml:space="preserve">failed replication </w:t>
+      </w:r>
+      <w:r>
+        <w:rPr>
+          <w:lang w:val="en-US"/>
+        </w:rPr>
+        <w:t xml:space="preserve">and </w:t>
+      </w:r>
+      <w:r>
+        <w:rPr>
+          <w:lang w:val="en-US"/>
+        </w:rPr>
+        <w:t>the general nature of the study and its possible conclusions, which were not related to self-direction, independence, or values-based action.</w:t>
       </w:r>
       <w:r>
         <w:rPr>
@@ -2850,7 +2899,7 @@
         <w:rPr>
           <w:lang w:val="en-US"/>
         </w:rPr>
-        <w:t xml:space="preserve">Of course, it is possible to find examples of more critical readings of Foody et al. (2013). Often, these come from researchers and journals that are not already strongly aligned with ACT and RFT. For example, Godbee &amp; Kangas </w:t>
+        <w:t xml:space="preserve">Of course, it is possible to find examples of more critical readings of Foody et al. (2013). For example, Godbee &amp; Kangas </w:t>
       </w:r>
       <w:r>
         <w:rPr>
@@ -3066,46 +3115,19 @@
     </w:p>
     <w:p>
       <w:r>
-        <w:t>The studies reanalysed here inform clinical practice: Acceptance and Commitment Therapy is a widely disseminated psychotherapy, and the claim that hierarchical framing relieves distress better than distinction framing has shaped how clinicians are trained</w:t>
-      </w:r>
-      <w:r>
-        <w:t xml:space="preserve"> or how they practice</w:t>
-      </w:r>
-      <w:r>
-        <w:t xml:space="preserve">, with patients in distress as the indirectly affected and vulnerable party. </w:t>
-      </w:r>
-      <w:r>
-        <w:t xml:space="preserve">Insofar as the original studies being verified are relevant to </w:t>
-      </w:r>
-      <w:r>
-        <w:t xml:space="preserve">clinical practice </w:t>
-      </w:r>
-      <w:r>
-        <w:t>and</w:t>
-      </w:r>
-      <w:r>
-        <w:t xml:space="preserve"> psychotherapists, </w:t>
-      </w:r>
-      <w:r>
-        <w:t xml:space="preserve">and therefore </w:t>
-      </w:r>
-      <w:r>
-        <w:t xml:space="preserve">patients as indirectly affected group, </w:t>
-      </w:r>
-      <w:r>
-        <w:t xml:space="preserve">so too are the results of this reanalysis. </w:t>
-      </w:r>
-      <w:r>
-        <w:t>The social value of this reanalysis is in helping such training rest on credible evidence. It is equally important, however, to bound the claim: I do not show that ACT is ineffective, that self-as-context is invalid, or that those who report benefiting from these exercises are mistaken</w:t>
+        <w:t>The studies reanalysed here inform clinical practice: Acceptance and Commitment Therapy is a widely disseminated psychotherapy, and the claim that hierarchical framing relieves distress better than distinction framing has influenced clinical training and practice, with patients in distress as the indirectly affected and vulnerable party. The social value of this reanalysis lies in helping such training and practice rest on credible evidence. These findings concern the credibility of a specific empirical claim, not clinical guidance</w:t>
+      </w:r>
+      <w:r>
+        <w:t>;</w:t>
+      </w:r>
+      <w:r>
+        <w:t xml:space="preserve"> decisions about practice rest on the broader evidence base and clinical judgement. It is equally important to bound the claim. I do not show that ACT is ineffective, that self-as-context is invalid, or that those who report benefiting from these exercises are mistaken</w:t>
       </w:r>
       <w:r>
         <w:t>,</w:t>
       </w:r>
       <w:r>
-        <w:t xml:space="preserve"> only that the specific data in Foody et al. (2013, 2015) do not support the specific claim examined</w:t>
-      </w:r>
-      <w:r>
-        <w:t xml:space="preserve">. These studies form only one line of inquiry into using RFT to inform ACT. </w:t>
+        <w:t xml:space="preserve"> only that the specific data in Foody et al. (2013, 2015) do not support the specific claim examined. These studies form just one line of inquiry into using RFT to inform ACT. </w:t>
       </w:r>
     </w:p>
     <w:p>
@@ -3971,38 +3993,6 @@
         </w:rPr>
         <w:t xml:space="preserve"> I return to this point later.</w:t>
       </w:r>
-    </w:p>
-    <w:p>
-      <w:pPr>
-        <w:rPr>
-          <w:rStyle w:val="citation"/>
-          <w:lang w:val="en-US"/>
-        </w:rPr>
-      </w:pPr>
-    </w:p>
-    <w:p>
-      <w:pPr>
-        <w:pStyle w:val="Heading1"/>
-        <w:rPr>
-          <w:lang w:val="en-US"/>
-        </w:rPr>
-      </w:pPr>
-    </w:p>
-    <w:p>
-      <w:pPr>
-        <w:pStyle w:val="Heading1"/>
-        <w:rPr>
-          <w:lang w:val="en-US"/>
-        </w:rPr>
-      </w:pPr>
-    </w:p>
-    <w:p>
-      <w:pPr>
-        <w:pStyle w:val="Heading1"/>
-        <w:rPr>
-          <w:lang w:val="en-US"/>
-        </w:rPr>
-      </w:pPr>
     </w:p>
     <w:p>
       <w:pPr>
@@ -6746,7 +6736,6 @@
         </w:rPr>
         <w:t xml:space="preserve">implemented using R’s </w:t>
       </w:r>
-      <w:proofErr w:type="spellStart"/>
       <w:proofErr w:type="gramStart"/>
       <w:r>
         <w:rPr>
@@ -6754,7 +6743,6 @@
         </w:rPr>
         <w:t>p.adjust</w:t>
       </w:r>
-      <w:proofErr w:type="spellEnd"/>
       <w:proofErr w:type="gramEnd"/>
       <w:r>
         <w:rPr>
@@ -8648,21 +8636,7 @@
         <w:rPr>
           <w:lang w:val="en-US"/>
         </w:rPr>
-        <w:t>), and degrees of freedom (</w:t>
-      </w:r>
-      <w:proofErr w:type="spellStart"/>
-      <w:r>
-        <w:rPr>
-          <w:lang w:val="en-US"/>
-        </w:rPr>
-        <w:t>df</w:t>
-      </w:r>
-      <w:proofErr w:type="spellEnd"/>
-      <w:r>
-        <w:rPr>
-          <w:lang w:val="en-US"/>
-        </w:rPr>
-        <w:t xml:space="preserve">) using </w:t>
+        <w:t xml:space="preserve">), and degrees of freedom (df) using </w:t>
       </w:r>
       <w:r>
         <w:rPr>
@@ -10013,7 +9987,6 @@
         </w:rPr>
         <w:t xml:space="preserve"> and </w:t>
       </w:r>
-      <w:proofErr w:type="spellStart"/>
       <w:r>
         <w:rPr>
           <w:i/>
@@ -10022,7 +9995,6 @@
         </w:rPr>
         <w:t>df</w:t>
       </w:r>
-      <w:proofErr w:type="spellEnd"/>
       <w:r>
         <w:rPr>
           <w:lang w:val="en-US"/>
@@ -11807,7 +11779,31 @@
         <w:rPr>
           <w:lang w:val="en-US"/>
         </w:rPr>
-        <w:t>. Starting from the top left, the reader can make one analytic decision at a time: starting with whether the results of Foody et al.’s (2013) RM-ANOVAs should simply be accepted on face value; if not, followed by whether merely correcting their results for multiple testing is sufficient; and if not, followed by which form of between groups effect size should be calculated. In summary, no set of analytic choices for Foody et al. (2013) followed by applying the same choice to the replication study in Foody et al. (2015) produce (a) a replicable result, and (b) all choices other than accepting Foody et al.’s (2013) RM-ANOVA results provide null results for all tests in both studies. Even for that exception, support for the hypothesis is limited to one out of three outcome measures, undermining Foody et al.’s (2013) general claim. This is remarkable given the way that the results of Foody et al. (2013) are referred to in other work – i.e., as evidence for the utility of RFT to ACT, and support for the ACT model of psychotherapy</w:t>
+        <w:t>. Starting from the top left, the reader can make one analytic decision at a time: starting with whether the results of Foody et al.’s (2013) RM-ANOVAs should simply be accepted on face value; if not, followed by whether merely correcting their results for multiple testing is sufficient; and if not, followed by which form of between groups effect size should be calculated. In summary, no set of analytic choices for Foody et al. (2013) followed by applying the same choice to the replication study in Foody et al. (2015) produce (a) a replicable result, and (b) all choices other than accepting Foody et al.’s (2013) RM-ANOVA results provide null results for all tests in both studies. Even for that exception, support for the hypothesis is limited to one out of three outcome measures, undermining Foody et al.’s (2013) general claim. This is remarkable given the way that the results of Foody et al. (2013) are referred to in other work</w:t>
+      </w:r>
+      <w:r>
+        <w:rPr>
+          <w:lang w:val="en-US"/>
+        </w:rPr>
+        <w:t>,</w:t>
+      </w:r>
+      <w:r>
+        <w:rPr>
+          <w:lang w:val="en-US"/>
+        </w:rPr>
+        <w:t xml:space="preserve"> </w:t>
+      </w:r>
+      <w:r>
+        <w:rPr>
+          <w:lang w:val="en-US"/>
+        </w:rPr>
+        <w:t>that is,</w:t>
+      </w:r>
+      <w:r>
+        <w:rPr>
+          <w:lang w:val="en-US"/>
+        </w:rPr>
+        <w:t xml:space="preserve"> as evidence for the utility of RFT to ACT, and support for the ACT model of psychotherapy</w:t>
       </w:r>
       <w:r>
         <w:rPr>
@@ -12391,6 +12387,7 @@
     </w:p>
     <w:p>
       <w:pPr>
+        <w:ind w:firstLine="0"/>
         <w:rPr>
           <w:lang w:val="en-US"/>
         </w:rPr>
@@ -12429,39 +12426,25 @@
         <w:rPr>
           <w:lang w:val="en-US"/>
         </w:rPr>
-        <w:t xml:space="preserve"> I declare that the I share a </w:t>
-      </w:r>
-      <w:proofErr w:type="spellStart"/>
-      <w:r>
-        <w:rPr>
-          <w:lang w:val="en-US"/>
-        </w:rPr>
-        <w:t>coauthorship</w:t>
-      </w:r>
-      <w:proofErr w:type="spellEnd"/>
-      <w:r>
-        <w:rPr>
-          <w:lang w:val="en-US"/>
-        </w:rPr>
-        <w:t xml:space="preserve"> of the Replication Database</w:t>
-      </w:r>
-      <w:r>
-        <w:rPr>
-          <w:lang w:val="en-US"/>
-        </w:rPr>
         <w:t xml:space="preserve"> </w:t>
       </w:r>
       <w:r>
         <w:rPr>
           <w:lang w:val="en-US"/>
         </w:rPr>
+        <w:t xml:space="preserve">I declare that I share a coauthorship with editor of the Journal of Replication Research: the Replication Database, a Big Team Science project with over 100 authors </w:t>
+      </w:r>
+      <w:r>
+        <w:rPr>
+          <w:lang w:val="en-US"/>
+        </w:rPr>
         <w:fldChar w:fldCharType="begin"/>
       </w:r>
       <w:r>
         <w:rPr>
           <w:lang w:val="en-US"/>
         </w:rPr>
-        <w:instrText xml:space="preserve"> ADDIN ZOTERO_ITEM CSL_CITATION {"citationID":"kAUGji2g","properties":{"unsorted":false,"formattedCitation":"(R\\uc0\\u246{}seler et al., 2024)","plainCitation":"(Röseler et al., 2024)","noteIndex":0},"citationItems":[{"id":38008,"uris":["http://zotero.org/users/1687755/items/85IJGAYT"],"itemData":{"id":38008,"type":"article-journal","abstract":"In psychological science, replicability—repeating a study with a new sample achieving consistent results ()—is critical for affirming the validity of scientific findings. Despite its importance, replication efforts are few and far between in psychological science with many attempts failing to corroborate past findings. This scarcity, compounded by the difficulty in accessing replication data, jeopardizes the efficient allocation of research resources and impedes scientific advancement. Addressing this crucial gap, we present the Replication Database (https://forrt-replications.shinyapps.io/fred_explorer), a novel platform hosting 1,239 original findings paired with replication findings. The infrastructure of this database allows researchers to submit, access, and engage with replication findings. The database makes replications visible, easily findable via a graphical user interface, and tracks replication rates across various factors, such as publication year or journal. This will facilitate future efforts to evaluate the robustness of psychological research.","container-title":"Journal of Open Psychology Data","DOI":"10.5334/jopd.101","ISSN":"2050-9863","issue":"1","journalAbbreviation":"J Open Psychol Data","page":"8","PMID":"40687679","PMCID":"PMC12270267","source":"PubMed Central","title":"The Replication Database: Documenting the Replicability of Psychological Science","title-short":"The Replication Database","volume":"12","author":[{"family":"Röseler","given":"Lukas"},{"family":"Kaiser","given":"Leonard"},{"family":"Doetsch","given":"Christopher"},{"family":"Klett","given":"Noah"},{"family":"Seida","given":"Christian"},{"family":"Schütz","given":"Astrid"},{"family":"Aczel","given":"Balazs"},{"family":"Adelina","given":"Nadia"},{"family":"Agostini","given":"Valeria"},{"family":"Alarie","given":"Samuel"},{"family":"Albayrak-Aydemir","given":"Nihan"},{"family":"Aldoh","given":"Alaa"},{"family":"Al-Hoorie","given":"Ali H."},{"family":"Azevedo","given":"Flavio"},{"family":"Baker","given":"Bradley J."},{"family":"Barth","given":"Charlotte Lilian"},{"family":"Beitner","given":"Julia"},{"family":"Brick","given":"Cameron"},{"family":"Brohmer","given":"Hilmar"},{"family":"Chandrashekar","given":"Subramanya Prasad"},{"family":"Chung","given":"Kai Li"},{"family":"Cockcroft","given":"Jamie P."},{"family":"Cummins","given":"Jamie"},{"family":"Diveica","given":"Veronica"},{"family":"Dumbalska","given":"Tsvetomira"},{"family":"Efendic","given":"Emir"},{"family":"Elsherif","given":"Mahmoud"},{"family":"Evans","given":"Thomas"},{"family":"Feldman","given":"Gilad"},{"family":"Fillon","given":"Adrien"},{"family":"Förster","given":"Nico"},{"family":"Frese","given":"Joris"},{"family":"Genschow","given":"Oliver"},{"family":"Giannouli","given":"Vaitsa"},{"family":"Gjoneska","given":"Biljana"},{"family":"Gnambs","given":"Timo"},{"family":"Gourdon-Kanhukamwe","given":"Amélie"},{"family":"Graham","given":"Christopher J."},{"family":"Hartmann","given":"Helena"},{"family":"Haviva","given":"Clove"},{"family":"Herderich","given":"Alina"},{"family":"Hilbert","given":"Leon P."},{"family":"Holgado","given":"Darías"},{"family":"Hussey","given":"Ian"},{"family":"Ilchovska","given":"Zlatomira G."},{"family":"Kalandadze","given":"Tamara"},{"family":"Karhulahti","given":"Veli-Matti"},{"family":"Kasseckert","given":"Leon"},{"family":"Klingelhöfer-Jens","given":"Maren"},{"family":"Koppold","given":"Alina"},{"family":"Korbmacher","given":"Max"},{"family":"Kulke","given":"Louisa"},{"family":"Kuper","given":"Niclas"},{"family":"LaPlume","given":"Annalise"},{"family":"Leech","given":"Gavin"},{"family":"Lohkamp","given":"Feline"},{"family":"Lou","given":"Nigel Mantou"},{"family":"Lynott","given":"Dermot"},{"family":"Maier","given":"Maximilian"},{"family":"Meier","given":"Maria"},{"family":"Montefinese","given":"Maria"},{"family":"Moreau","given":"David"},{"family":"Mrkva","given":"Kellen"},{"family":"Nemcova","given":"Monika"},{"family":"Oomen","given":"Danna"},{"family":"Packheiser","given":"Julian"},{"family":"Pandey","given":"Shubham"},{"family":"Papenmeier","given":"Frank"},{"family":"Paruzel-Czachura","given":"Mariola"},{"family":"Pavlov","given":"Yuri G."},{"family":"Pavlović","given":"Zoran"},{"family":"Pennington","given":"Charlotte R."},{"family":"Pittelkow","given":"Merle-Marie"},{"family":"Plomp","given":"Willemijn"},{"family":"Plonski","given":"Paul E."},{"family":"Pronizius","given":"Ekaterina"},{"family":"Pua","given":"Andrew Adrian"},{"family":"Pypno-Blajda","given":"Katarzyna"},{"family":"Rausch","given":"Manuel"},{"family":"Rebholz","given":"Tobias R."},{"family":"Richert","given":"Elena"},{"family":"Röer","given":"Jan Philipp"},{"family":"Ross","given":"Robert"},{"family":"Schmidt","given":"Kathleen"},{"family":"Skvortsova","given":"Aleksandrina"},{"family":"Sperl","given":"Matthias F. J."},{"family":"Tan","given":"Alvin W. M."},{"family":"Thürmer","given":"J. Lukas"},{"family":"Tołopiło","given":"Aleksandra"},{"family":"Vanpaemel","given":"Wolf"},{"family":"Vaughn","given":"Leigh Ann"},{"family":"Verheyen","given":"Steven"},{"family":"Wallrich","given":"Lukas"},{"family":"Weber","given":"Lucia"},{"family":"Wolska","given":"Julia K."},{"family":"Zaneva","given":"Mirela"},{"family":"Zhang","given":"Yikang"}],"issued":{"date-parts":[["2024"]]}}}],"schema":"https://github.com/citation-style-language/schema/raw/master/csl-citation.json"} </w:instrText>
+        <w:instrText xml:space="preserve"> ADDIN ZOTERO_ITEM CSL_CITATION {"citationID":"0VX4Wijp","properties":{"unsorted":false,"formattedCitation":"(R\\uc0\\u246{}seler et al., 2024)","plainCitation":"(Röseler et al., 2024)","noteIndex":0},"citationItems":[{"id":38008,"uris":["http://zotero.org/users/1687755/items/85IJGAYT"],"itemData":{"id":38008,"type":"article-journal","abstract":"In psychological science, replicability—repeating a study with a new sample achieving consistent results ()—is critical for affirming the validity of scientific findings. Despite its importance, replication efforts are few and far between in psychological science with many attempts failing to corroborate past findings. This scarcity, compounded by the difficulty in accessing replication data, jeopardizes the efficient allocation of research resources and impedes scientific advancement. Addressing this crucial gap, we present the Replication Database (https://forrt-replications.shinyapps.io/fred_explorer), a novel platform hosting 1,239 original findings paired with replication findings. The infrastructure of this database allows researchers to submit, access, and engage with replication findings. The database makes replications visible, easily findable via a graphical user interface, and tracks replication rates across various factors, such as publication year or journal. This will facilitate future efforts to evaluate the robustness of psychological research.","container-title":"Journal of Open Psychology Data","DOI":"10.5334/jopd.101","ISSN":"2050-9863","issue":"1","journalAbbreviation":"J Open Psychol Data","page":"8","PMID":"40687679","PMCID":"PMC12270267","source":"PubMed Central","title":"The Replication Database: Documenting the Replicability of Psychological Science","title-short":"The Replication Database","volume":"12","author":[{"family":"Röseler","given":"Lukas"},{"family":"Kaiser","given":"Leonard"},{"family":"Doetsch","given":"Christopher"},{"family":"Klett","given":"Noah"},{"family":"Seida","given":"Christian"},{"family":"Schütz","given":"Astrid"},{"family":"Aczel","given":"Balazs"},{"family":"Adelina","given":"Nadia"},{"family":"Agostini","given":"Valeria"},{"family":"Alarie","given":"Samuel"},{"family":"Albayrak-Aydemir","given":"Nihan"},{"family":"Aldoh","given":"Alaa"},{"family":"Al-Hoorie","given":"Ali H."},{"family":"Azevedo","given":"Flavio"},{"family":"Baker","given":"Bradley J."},{"family":"Barth","given":"Charlotte Lilian"},{"family":"Beitner","given":"Julia"},{"family":"Brick","given":"Cameron"},{"family":"Brohmer","given":"Hilmar"},{"family":"Chandrashekar","given":"Subramanya Prasad"},{"family":"Chung","given":"Kai Li"},{"family":"Cockcroft","given":"Jamie P."},{"family":"Cummins","given":"Jamie"},{"family":"Diveica","given":"Veronica"},{"family":"Dumbalska","given":"Tsvetomira"},{"family":"Efendic","given":"Emir"},{"family":"Elsherif","given":"Mahmoud"},{"family":"Evans","given":"Thomas"},{"family":"Feldman","given":"Gilad"},{"family":"Fillon","given":"Adrien"},{"family":"Förster","given":"Nico"},{"family":"Frese","given":"Joris"},{"family":"Genschow","given":"Oliver"},{"family":"Giannouli","given":"Vaitsa"},{"family":"Gjoneska","given":"Biljana"},{"family":"Gnambs","given":"Timo"},{"family":"Gourdon-Kanhukamwe","given":"Amélie"},{"family":"Graham","given":"Christopher J."},{"family":"Hartmann","given":"Helena"},{"family":"Haviva","given":"Clove"},{"family":"Herderich","given":"Alina"},{"family":"Hilbert","given":"Leon P."},{"family":"Holgado","given":"Darías"},{"family":"Hussey","given":"Ian"},{"family":"Ilchovska","given":"Zlatomira G."},{"family":"Kalandadze","given":"Tamara"},{"family":"Karhulahti","given":"Veli-Matti"},{"family":"Kasseckert","given":"Leon"},{"family":"Klingelhöfer-Jens","given":"Maren"},{"family":"Koppold","given":"Alina"},{"family":"Korbmacher","given":"Max"},{"family":"Kulke","given":"Louisa"},{"family":"Kuper","given":"Niclas"},{"family":"LaPlume","given":"Annalise"},{"family":"Leech","given":"Gavin"},{"family":"Lohkamp","given":"Feline"},{"family":"Lou","given":"Nigel Mantou"},{"family":"Lynott","given":"Dermot"},{"family":"Maier","given":"Maximilian"},{"family":"Meier","given":"Maria"},{"family":"Montefinese","given":"Maria"},{"family":"Moreau","given":"David"},{"family":"Mrkva","given":"Kellen"},{"family":"Nemcova","given":"Monika"},{"family":"Oomen","given":"Danna"},{"family":"Packheiser","given":"Julian"},{"family":"Pandey","given":"Shubham"},{"family":"Papenmeier","given":"Frank"},{"family":"Paruzel-Czachura","given":"Mariola"},{"family":"Pavlov","given":"Yuri G."},{"family":"Pavlović","given":"Zoran"},{"family":"Pennington","given":"Charlotte R."},{"family":"Pittelkow","given":"Merle-Marie"},{"family":"Plomp","given":"Willemijn"},{"family":"Plonski","given":"Paul E."},{"family":"Pronizius","given":"Ekaterina"},{"family":"Pua","given":"Andrew Adrian"},{"family":"Pypno-Blajda","given":"Katarzyna"},{"family":"Rausch","given":"Manuel"},{"family":"Rebholz","given":"Tobias R."},{"family":"Richert","given":"Elena"},{"family":"Röer","given":"Jan Philipp"},{"family":"Ross","given":"Robert"},{"family":"Schmidt","given":"Kathleen"},{"family":"Skvortsova","given":"Aleksandrina"},{"family":"Sperl","given":"Matthias F. J."},{"family":"Tan","given":"Alvin W. M."},{"family":"Thürmer","given":"J. Lukas"},{"family":"Tołopiło","given":"Aleksandra"},{"family":"Vanpaemel","given":"Wolf"},{"family":"Vaughn","given":"Leigh Ann"},{"family":"Verheyen","given":"Steven"},{"family":"Wallrich","given":"Lukas"},{"family":"Weber","given":"Lucia"},{"family":"Wolska","given":"Julia K."},{"family":"Zaneva","given":"Mirela"},{"family":"Zhang","given":"Yikang"}],"issued":{"date-parts":[["2024"]]}}}],"schema":"https://github.com/citation-style-language/schema/raw/master/csl-citation.json"} </w:instrText>
       </w:r>
       <w:r>
         <w:rPr>
@@ -12475,25 +12458,7 @@
           <w:szCs w:val="24"/>
           <w:lang w:val="en-GB" w:eastAsia="en-US"/>
         </w:rPr>
-        <w:t>(</w:t>
-      </w:r>
-      <w:proofErr w:type="spellStart"/>
-      <w:r>
-        <w:rPr>
-          <w:rFonts w:eastAsiaTheme="minorHAnsi"/>
-          <w:szCs w:val="24"/>
-          <w:lang w:val="en-GB" w:eastAsia="en-US"/>
-        </w:rPr>
-        <w:t>Röseler</w:t>
-      </w:r>
-      <w:proofErr w:type="spellEnd"/>
-      <w:r>
-        <w:rPr>
-          <w:rFonts w:eastAsiaTheme="minorHAnsi"/>
-          <w:szCs w:val="24"/>
-          <w:lang w:val="en-GB" w:eastAsia="en-US"/>
-        </w:rPr>
-        <w:t xml:space="preserve"> et al., 2024)</w:t>
+        <w:t>(Röseler et al., 2024)</w:t>
       </w:r>
       <w:r>
         <w:rPr>
@@ -12505,22 +12470,8 @@
         <w:rPr>
           <w:lang w:val="en-US"/>
         </w:rPr>
-        <w:t>,</w:t>
-      </w:r>
-      <w:r>
-        <w:rPr>
-          <w:lang w:val="en-US"/>
-        </w:rPr>
-        <w:t xml:space="preserve"> a Big Team Science project with over 100 authors, with editor of the Journal of Replication Research. </w:t>
-      </w:r>
-    </w:p>
-    <w:p>
-      <w:pPr>
-        <w:ind w:firstLine="0"/>
-        <w:rPr>
-          <w:lang w:val="en-US"/>
-        </w:rPr>
-      </w:pPr>
+        <w:t>.”</w:t>
+      </w:r>
     </w:p>
     <w:p>
       <w:pPr>
@@ -12583,7 +12534,7 @@
           <w:rFonts w:eastAsiaTheme="minorHAnsi"/>
           <w:lang w:eastAsia="en-US"/>
         </w:rPr>
-        <w:t xml:space="preserve"> (pp. 365–382). Blackwell-</w:t>
+        <w:t xml:space="preserve"> (pp. 365–382). Blackwell-Wiley. </w:t>
       </w:r>
       <w:r>
         <w:rPr>
@@ -12591,7 +12542,7 @@
           <w:lang w:eastAsia="en-US"/>
         </w:rPr>
         <w:lastRenderedPageBreak/>
-        <w:t>Wiley. http://onlinelibrary.wiley.com/doi/10.1002/9781118489857.ch18/</w:t>
+        <w:t>http://onlinelibrary.wiley.com/doi/10.1002/9781118489857.ch18/</w:t>
       </w:r>
     </w:p>
     <w:p>

</xml_diff>

<commit_message>
corrected description of intervals
</commit_message>
<xml_diff>
--- a/communication/preprint/Hussey - 2026 - a critical reanalysis of Foody et al. 2013.docx
+++ b/communication/preprint/Hussey - 2026 - a critical reanalysis of Foody et al. 2013.docx
@@ -10838,7 +10838,35 @@
           <w:b w:val="0"/>
           <w:bCs w:val="0"/>
         </w:rPr>
-        <w:t xml:space="preserve"> Error bars represent 95% Confidence Intervals.</w:t>
+        <w:t xml:space="preserve"> Error bars represent 95% </w:t>
+      </w:r>
+      <w:r>
+        <w:rPr>
+          <w:b w:val="0"/>
+          <w:bCs w:val="0"/>
+        </w:rPr>
+        <w:t xml:space="preserve">or 98.33% </w:t>
+      </w:r>
+      <w:r>
+        <w:rPr>
+          <w:b w:val="0"/>
+          <w:bCs w:val="0"/>
+        </w:rPr>
+        <w:t>Confidence Intervals</w:t>
+      </w:r>
+      <w:r>
+        <w:rPr>
+          <w:b w:val="0"/>
+          <w:bCs w:val="0"/>
+        </w:rPr>
+        <w:t xml:space="preserve"> depending on the use of Bonferroni corrections</w:t>
+      </w:r>
+      <w:r>
+        <w:rPr>
+          <w:b w:val="0"/>
+          <w:bCs w:val="0"/>
+        </w:rPr>
+        <w:t>.</w:t>
       </w:r>
     </w:p>
     <w:p>
@@ -10952,7 +10980,35 @@
           <w:b w:val="0"/>
           <w:bCs w:val="0"/>
         </w:rPr>
-        <w:t>Error bars represent 95% Confidence Intervals.</w:t>
+        <w:t xml:space="preserve">Error bars represent 95% </w:t>
+      </w:r>
+      <w:r>
+        <w:rPr>
+          <w:b w:val="0"/>
+          <w:bCs w:val="0"/>
+        </w:rPr>
+        <w:t xml:space="preserve">or 98.33% </w:t>
+      </w:r>
+      <w:r>
+        <w:rPr>
+          <w:b w:val="0"/>
+          <w:bCs w:val="0"/>
+        </w:rPr>
+        <w:t>Confidence Intervals</w:t>
+      </w:r>
+      <w:r>
+        <w:rPr>
+          <w:b w:val="0"/>
+          <w:bCs w:val="0"/>
+        </w:rPr>
+        <w:t xml:space="preserve"> depending on the use of Bonferroni corrections</w:t>
+      </w:r>
+      <w:r>
+        <w:rPr>
+          <w:b w:val="0"/>
+          <w:bCs w:val="0"/>
+        </w:rPr>
+        <w:t>.</w:t>
       </w:r>
     </w:p>
     <w:p>

</xml_diff>